<commit_message>
Paineis e apostila: "dossie" passa a "perfil da unidade" (pedido da coordenacao); apostila v1.4
Texto visivel dos tres paineis (botoes, titulos, ajuda, metodologia), pagina principal, README dos paineis e apostila
(v1.4, com registro no historico de versoes). Identificadores de codigo e enderecos nao mudam. Nenhum numero mudou.

Co-Authored-By: Claude Fable 5.1 <noreply@anthropic.com>
</commit_message>
<xml_diff>
--- a/docs/Apostila_Dicionarios_de_Dados_Paineis_Maternidades.docx
+++ b/docs/Apostila_Dicionarios_de_Dados_Paineis_Maternidades.docx
@@ -11,7 +11,7 @@
           <w:noProof/>
         </w:rPr>
         <w:drawing>
-          <wp:inline distT="0" distB="0" distL="0" distR="0" wp14:anchorId="2C0B5E76" wp14:editId="4B33AA0F">
+          <wp:inline distT="0" distB="0" distL="0" distR="0" wp14:anchorId="3E9C5D9B" wp14:editId="0FBFCF37">
             <wp:extent cx="6096000" cy="704850"/>
             <wp:effectExtent l="0" t="0" r="0" b="0"/>
             <wp:docPr id="1" name="faixa" descr="Elemento decorativo, sem conteúdo informativo." title="Faixa decorativa"/>
@@ -59,7 +59,7 @@
           <w:noProof/>
         </w:rPr>
         <w:drawing>
-          <wp:inline distT="0" distB="0" distL="0" distR="0" wp14:anchorId="180FEF72" wp14:editId="3661B4C4">
+          <wp:inline distT="0" distB="0" distL="0" distR="0" wp14:anchorId="4C7D2488" wp14:editId="77EF4E0B">
             <wp:extent cx="4572000" cy="390525"/>
             <wp:effectExtent l="0" t="0" r="0" b="0"/>
             <wp:docPr id="2" name="logos" descr="Marcas do Instituto Nacional de Saúde da Mulher, da Criança e do Adolescente Fernandes Figueira (IFF), da Fiocruz, do SUS e do Ministério da Saúde." title="Marcas institucionais"/>
@@ -184,7 +184,7 @@
           <w:bCs/>
           <w:color w:val="1E6E49"/>
         </w:rPr>
-        <w:t>Versão 1.3 · Rio de Janeiro, 18 de outubro de 2026</w:t>
+        <w:t>Versão 1.4 · Rio de Janeiro, 18 de outubro de 2026</w:t>
       </w:r>
     </w:p>
     <w:p>
@@ -240,7 +240,7 @@
     <w:sdt>
       <w:sdtPr>
         <w:alias w:val="Sumário"/>
-        <w:id w:val="1729646258"/>
+        <w:id w:val="-1258980410"/>
       </w:sdtPr>
       <w:sdtEndPr/>
       <w:sdtContent>
@@ -263,7 +263,7 @@
           <w:r>
             <w:fldChar w:fldCharType="separate"/>
           </w:r>
-          <w:hyperlink w:anchor="_Toc243245216" w:history="1">
+          <w:hyperlink w:anchor="_Toc243245573" w:history="1">
             <w:r>
               <w:rPr>
                 <w:rStyle w:val="Hyperlink"/>
@@ -287,7 +287,7 @@
               <w:rPr>
                 <w:noProof/>
               </w:rPr>
-              <w:instrText xml:space="preserve"> PAGEREF _Toc243245216 \h </w:instrText>
+              <w:instrText xml:space="preserve"> PAGEREF _Toc243245573 \h </w:instrText>
             </w:r>
             <w:r>
               <w:rPr>
@@ -324,7 +324,7 @@
               <w:noProof/>
             </w:rPr>
           </w:pPr>
-          <w:hyperlink w:anchor="_Toc243245217" w:history="1">
+          <w:hyperlink w:anchor="_Toc243245574" w:history="1">
             <w:r>
               <w:rPr>
                 <w:rStyle w:val="Hyperlink"/>
@@ -348,7 +348,7 @@
               <w:rPr>
                 <w:noProof/>
               </w:rPr>
-              <w:instrText xml:space="preserve"> PAGEREF _Toc243245217 \h </w:instrText>
+              <w:instrText xml:space="preserve"> PAGEREF _Toc243245574 \h </w:instrText>
             </w:r>
             <w:r>
               <w:rPr>
@@ -385,7 +385,7 @@
               <w:noProof/>
             </w:rPr>
           </w:pPr>
-          <w:hyperlink w:anchor="_Toc243245218" w:history="1">
+          <w:hyperlink w:anchor="_Toc243245575" w:history="1">
             <w:r>
               <w:rPr>
                 <w:rStyle w:val="Hyperlink"/>
@@ -409,7 +409,7 @@
               <w:rPr>
                 <w:noProof/>
               </w:rPr>
-              <w:instrText xml:space="preserve"> PAGEREF _Toc243245218 \h </w:instrText>
+              <w:instrText xml:space="preserve"> PAGEREF _Toc243245575 \h </w:instrText>
             </w:r>
             <w:r>
               <w:rPr>
@@ -446,7 +446,7 @@
               <w:noProof/>
             </w:rPr>
           </w:pPr>
-          <w:hyperlink w:anchor="_Toc243245219" w:history="1">
+          <w:hyperlink w:anchor="_Toc243245576" w:history="1">
             <w:r>
               <w:rPr>
                 <w:rStyle w:val="Hyperlink"/>
@@ -470,7 +470,7 @@
               <w:rPr>
                 <w:noProof/>
               </w:rPr>
-              <w:instrText xml:space="preserve"> PAGEREF _Toc243245219 \h </w:instrText>
+              <w:instrText xml:space="preserve"> PAGEREF _Toc243245576 \h </w:instrText>
             </w:r>
             <w:r>
               <w:rPr>
@@ -507,7 +507,7 @@
               <w:noProof/>
             </w:rPr>
           </w:pPr>
-          <w:hyperlink w:anchor="_Toc243245220" w:history="1">
+          <w:hyperlink w:anchor="_Toc243245577" w:history="1">
             <w:r>
               <w:rPr>
                 <w:rStyle w:val="Hyperlink"/>
@@ -531,7 +531,7 @@
               <w:rPr>
                 <w:noProof/>
               </w:rPr>
-              <w:instrText xml:space="preserve"> PAGEREF _Toc243245220 \h </w:instrText>
+              <w:instrText xml:space="preserve"> PAGEREF _Toc243245577 \h </w:instrText>
             </w:r>
             <w:r>
               <w:rPr>
@@ -568,7 +568,7 @@
               <w:noProof/>
             </w:rPr>
           </w:pPr>
-          <w:hyperlink w:anchor="_Toc243245221" w:history="1">
+          <w:hyperlink w:anchor="_Toc243245578" w:history="1">
             <w:r>
               <w:rPr>
                 <w:rStyle w:val="Hyperlink"/>
@@ -592,7 +592,7 @@
               <w:rPr>
                 <w:noProof/>
               </w:rPr>
-              <w:instrText xml:space="preserve"> PAGEREF _Toc243245221 \h </w:instrText>
+              <w:instrText xml:space="preserve"> PAGEREF _Toc243245578 \h </w:instrText>
             </w:r>
             <w:r>
               <w:rPr>
@@ -629,7 +629,7 @@
               <w:noProof/>
             </w:rPr>
           </w:pPr>
-          <w:hyperlink w:anchor="_Toc243245222" w:history="1">
+          <w:hyperlink w:anchor="_Toc243245579" w:history="1">
             <w:r>
               <w:rPr>
                 <w:rStyle w:val="Hyperlink"/>
@@ -653,7 +653,7 @@
               <w:rPr>
                 <w:noProof/>
               </w:rPr>
-              <w:instrText xml:space="preserve"> PAGEREF _Toc243245222 \h </w:instrText>
+              <w:instrText xml:space="preserve"> PAGEREF _Toc243245579 \h </w:instrText>
             </w:r>
             <w:r>
               <w:rPr>
@@ -690,7 +690,7 @@
               <w:noProof/>
             </w:rPr>
           </w:pPr>
-          <w:hyperlink w:anchor="_Toc243245223" w:history="1">
+          <w:hyperlink w:anchor="_Toc243245580" w:history="1">
             <w:r>
               <w:rPr>
                 <w:rStyle w:val="Hyperlink"/>
@@ -714,7 +714,7 @@
               <w:rPr>
                 <w:noProof/>
               </w:rPr>
-              <w:instrText xml:space="preserve"> PAGEREF _Toc243245223 \h </w:instrText>
+              <w:instrText xml:space="preserve"> PAGEREF _Toc243245580 \h </w:instrText>
             </w:r>
             <w:r>
               <w:rPr>
@@ -751,7 +751,7 @@
               <w:noProof/>
             </w:rPr>
           </w:pPr>
-          <w:hyperlink w:anchor="_Toc243245224" w:history="1">
+          <w:hyperlink w:anchor="_Toc243245581" w:history="1">
             <w:r>
               <w:rPr>
                 <w:rStyle w:val="Hyperlink"/>
@@ -775,7 +775,7 @@
               <w:rPr>
                 <w:noProof/>
               </w:rPr>
-              <w:instrText xml:space="preserve"> PAGEREF _Toc243245224 \h </w:instrText>
+              <w:instrText xml:space="preserve"> PAGEREF _Toc243245581 \h </w:instrText>
             </w:r>
             <w:r>
               <w:rPr>
@@ -812,7 +812,7 @@
               <w:noProof/>
             </w:rPr>
           </w:pPr>
-          <w:hyperlink w:anchor="_Toc243245225" w:history="1">
+          <w:hyperlink w:anchor="_Toc243245582" w:history="1">
             <w:r>
               <w:rPr>
                 <w:rStyle w:val="Hyperlink"/>
@@ -836,7 +836,7 @@
               <w:rPr>
                 <w:noProof/>
               </w:rPr>
-              <w:instrText xml:space="preserve"> PAGEREF _Toc243245225 \h </w:instrText>
+              <w:instrText xml:space="preserve"> PAGEREF _Toc243245582 \h </w:instrText>
             </w:r>
             <w:r>
               <w:rPr>
@@ -873,7 +873,7 @@
               <w:noProof/>
             </w:rPr>
           </w:pPr>
-          <w:hyperlink w:anchor="_Toc243245226" w:history="1">
+          <w:hyperlink w:anchor="_Toc243245583" w:history="1">
             <w:r>
               <w:rPr>
                 <w:rStyle w:val="Hyperlink"/>
@@ -897,7 +897,7 @@
               <w:rPr>
                 <w:noProof/>
               </w:rPr>
-              <w:instrText xml:space="preserve"> PAGEREF _Toc243245226 \h </w:instrText>
+              <w:instrText xml:space="preserve"> PAGEREF _Toc243245583 \h </w:instrText>
             </w:r>
             <w:r>
               <w:rPr>
@@ -934,7 +934,7 @@
               <w:noProof/>
             </w:rPr>
           </w:pPr>
-          <w:hyperlink w:anchor="_Toc243245227" w:history="1">
+          <w:hyperlink w:anchor="_Toc243245584" w:history="1">
             <w:r>
               <w:rPr>
                 <w:rStyle w:val="Hyperlink"/>
@@ -958,7 +958,7 @@
               <w:rPr>
                 <w:noProof/>
               </w:rPr>
-              <w:instrText xml:space="preserve"> PAGEREF _Toc243245227 \h </w:instrText>
+              <w:instrText xml:space="preserve"> PAGEREF _Toc243245584 \h </w:instrText>
             </w:r>
             <w:r>
               <w:rPr>
@@ -995,7 +995,7 @@
               <w:noProof/>
             </w:rPr>
           </w:pPr>
-          <w:hyperlink w:anchor="_Toc243245228" w:history="1">
+          <w:hyperlink w:anchor="_Toc243245585" w:history="1">
             <w:r>
               <w:rPr>
                 <w:rStyle w:val="Hyperlink"/>
@@ -1019,7 +1019,7 @@
               <w:rPr>
                 <w:noProof/>
               </w:rPr>
-              <w:instrText xml:space="preserve"> PAGEREF _Toc243245228 \h </w:instrText>
+              <w:instrText xml:space="preserve"> PAGEREF _Toc243245585 \h </w:instrText>
             </w:r>
             <w:r>
               <w:rPr>
@@ -1056,13 +1056,13 @@
               <w:noProof/>
             </w:rPr>
           </w:pPr>
-          <w:hyperlink w:anchor="_Toc243245229" w:history="1">
+          <w:hyperlink w:anchor="_Toc243245586" w:history="1">
             <w:r>
               <w:rPr>
                 <w:rStyle w:val="Hyperlink"/>
                 <w:noProof/>
               </w:rPr>
-              <w:t>4.4 Perfil da mãe (quadros do dossiê)</w:t>
+              <w:t>4.4 Perfil da mãe (quadros do perfil da unidade)</w:t>
             </w:r>
             <w:r>
               <w:rPr>
@@ -1080,7 +1080,7 @@
               <w:rPr>
                 <w:noProof/>
               </w:rPr>
-              <w:instrText xml:space="preserve"> PAGEREF _Toc243245229 \h </w:instrText>
+              <w:instrText xml:space="preserve"> PAGEREF _Toc243245586 \h </w:instrText>
             </w:r>
             <w:r>
               <w:rPr>
@@ -1117,13 +1117,13 @@
               <w:noProof/>
             </w:rPr>
           </w:pPr>
-          <w:hyperlink w:anchor="_Toc243245230" w:history="1">
+          <w:hyperlink w:anchor="_Toc243245587" w:history="1">
             <w:r>
               <w:rPr>
                 <w:rStyle w:val="Hyperlink"/>
                 <w:noProof/>
               </w:rPr>
-              <w:t>4.5 Tabelas do dossiê (blocos de nascidos vivos)</w:t>
+              <w:t>4.5 Tabelas do perfil da unidade (blocos de nascidos vivos)</w:t>
             </w:r>
             <w:r>
               <w:rPr>
@@ -1141,7 +1141,7 @@
               <w:rPr>
                 <w:noProof/>
               </w:rPr>
-              <w:instrText xml:space="preserve"> PAGEREF _Toc243245230 \h </w:instrText>
+              <w:instrText xml:space="preserve"> PAGEREF _Toc243245587 \h </w:instrText>
             </w:r>
             <w:r>
               <w:rPr>
@@ -1178,7 +1178,7 @@
               <w:noProof/>
             </w:rPr>
           </w:pPr>
-          <w:hyperlink w:anchor="_Toc243245231" w:history="1">
+          <w:hyperlink w:anchor="_Toc243245588" w:history="1">
             <w:r>
               <w:rPr>
                 <w:rStyle w:val="Hyperlink"/>
@@ -1202,7 +1202,7 @@
               <w:rPr>
                 <w:noProof/>
               </w:rPr>
-              <w:instrText xml:space="preserve"> PAGEREF _Toc243245231 \h </w:instrText>
+              <w:instrText xml:space="preserve"> PAGEREF _Toc243245588 \h </w:instrText>
             </w:r>
             <w:r>
               <w:rPr>
@@ -1239,7 +1239,7 @@
               <w:noProof/>
             </w:rPr>
           </w:pPr>
-          <w:hyperlink w:anchor="_Toc243245232" w:history="1">
+          <w:hyperlink w:anchor="_Toc243245589" w:history="1">
             <w:r>
               <w:rPr>
                 <w:rStyle w:val="Hyperlink"/>
@@ -1263,7 +1263,7 @@
               <w:rPr>
                 <w:noProof/>
               </w:rPr>
-              <w:instrText xml:space="preserve"> PAGEREF _Toc243245232 \h </w:instrText>
+              <w:instrText xml:space="preserve"> PAGEREF _Toc243245589 \h </w:instrText>
             </w:r>
             <w:r>
               <w:rPr>
@@ -1280,7 +1280,7 @@
               <w:rPr>
                 <w:noProof/>
               </w:rPr>
-              <w:t>18</w:t>
+              <w:t>19</w:t>
             </w:r>
             <w:r>
               <w:rPr>
@@ -1300,7 +1300,7 @@
               <w:noProof/>
             </w:rPr>
           </w:pPr>
-          <w:hyperlink w:anchor="_Toc243245233" w:history="1">
+          <w:hyperlink w:anchor="_Toc243245590" w:history="1">
             <w:r>
               <w:rPr>
                 <w:rStyle w:val="Hyperlink"/>
@@ -1324,7 +1324,7 @@
               <w:rPr>
                 <w:noProof/>
               </w:rPr>
-              <w:instrText xml:space="preserve"> PAGEREF _Toc243245233 \h </w:instrText>
+              <w:instrText xml:space="preserve"> PAGEREF _Toc243245590 \h </w:instrText>
             </w:r>
             <w:r>
               <w:rPr>
@@ -1361,7 +1361,7 @@
               <w:noProof/>
             </w:rPr>
           </w:pPr>
-          <w:hyperlink w:anchor="_Toc243245234" w:history="1">
+          <w:hyperlink w:anchor="_Toc243245591" w:history="1">
             <w:r>
               <w:rPr>
                 <w:rStyle w:val="Hyperlink"/>
@@ -1385,7 +1385,7 @@
               <w:rPr>
                 <w:noProof/>
               </w:rPr>
-              <w:instrText xml:space="preserve"> PAGEREF _Toc243245234 \h </w:instrText>
+              <w:instrText xml:space="preserve"> PAGEREF _Toc243245591 \h </w:instrText>
             </w:r>
             <w:r>
               <w:rPr>
@@ -1402,7 +1402,7 @@
               <w:rPr>
                 <w:noProof/>
               </w:rPr>
-              <w:t>26</w:t>
+              <w:t>27</w:t>
             </w:r>
             <w:r>
               <w:rPr>
@@ -1422,7 +1422,7 @@
               <w:noProof/>
             </w:rPr>
           </w:pPr>
-          <w:hyperlink w:anchor="_Toc243245235" w:history="1">
+          <w:hyperlink w:anchor="_Toc243245592" w:history="1">
             <w:r>
               <w:rPr>
                 <w:rStyle w:val="Hyperlink"/>
@@ -1446,7 +1446,7 @@
               <w:rPr>
                 <w:noProof/>
               </w:rPr>
-              <w:instrText xml:space="preserve"> PAGEREF _Toc243245235 \h </w:instrText>
+              <w:instrText xml:space="preserve"> PAGEREF _Toc243245592 \h </w:instrText>
             </w:r>
             <w:r>
               <w:rPr>
@@ -1483,7 +1483,7 @@
               <w:noProof/>
             </w:rPr>
           </w:pPr>
-          <w:hyperlink w:anchor="_Toc243245236" w:history="1">
+          <w:hyperlink w:anchor="_Toc243245593" w:history="1">
             <w:r>
               <w:rPr>
                 <w:rStyle w:val="Hyperlink"/>
@@ -1507,7 +1507,7 @@
               <w:rPr>
                 <w:noProof/>
               </w:rPr>
-              <w:instrText xml:space="preserve"> PAGEREF _Toc243245236 \h </w:instrText>
+              <w:instrText xml:space="preserve"> PAGEREF _Toc243245593 \h </w:instrText>
             </w:r>
             <w:r>
               <w:rPr>
@@ -1544,7 +1544,7 @@
               <w:noProof/>
             </w:rPr>
           </w:pPr>
-          <w:hyperlink w:anchor="_Toc243245237" w:history="1">
+          <w:hyperlink w:anchor="_Toc243245594" w:history="1">
             <w:r>
               <w:rPr>
                 <w:rStyle w:val="Hyperlink"/>
@@ -1568,7 +1568,7 @@
               <w:rPr>
                 <w:noProof/>
               </w:rPr>
-              <w:instrText xml:space="preserve"> PAGEREF _Toc243245237 \h </w:instrText>
+              <w:instrText xml:space="preserve"> PAGEREF _Toc243245594 \h </w:instrText>
             </w:r>
             <w:r>
               <w:rPr>
@@ -1605,7 +1605,7 @@
               <w:noProof/>
             </w:rPr>
           </w:pPr>
-          <w:hyperlink w:anchor="_Toc243245238" w:history="1">
+          <w:hyperlink w:anchor="_Toc243245595" w:history="1">
             <w:r>
               <w:rPr>
                 <w:rStyle w:val="Hyperlink"/>
@@ -1629,7 +1629,7 @@
               <w:rPr>
                 <w:noProof/>
               </w:rPr>
-              <w:instrText xml:space="preserve"> PAGEREF _Toc243245238 \h </w:instrText>
+              <w:instrText xml:space="preserve"> PAGEREF _Toc243245595 \h </w:instrText>
             </w:r>
             <w:r>
               <w:rPr>
@@ -1666,7 +1666,7 @@
               <w:noProof/>
             </w:rPr>
           </w:pPr>
-          <w:hyperlink w:anchor="_Toc243245239" w:history="1">
+          <w:hyperlink w:anchor="_Toc243245596" w:history="1">
             <w:r>
               <w:rPr>
                 <w:rStyle w:val="Hyperlink"/>
@@ -1690,7 +1690,7 @@
               <w:rPr>
                 <w:noProof/>
               </w:rPr>
-              <w:instrText xml:space="preserve"> PAGEREF _Toc243245239 \h </w:instrText>
+              <w:instrText xml:space="preserve"> PAGEREF _Toc243245596 \h </w:instrText>
             </w:r>
             <w:r>
               <w:rPr>
@@ -1727,7 +1727,7 @@
               <w:noProof/>
             </w:rPr>
           </w:pPr>
-          <w:hyperlink w:anchor="_Toc243245240" w:history="1">
+          <w:hyperlink w:anchor="_Toc243245597" w:history="1">
             <w:r>
               <w:rPr>
                 <w:rStyle w:val="Hyperlink"/>
@@ -1751,7 +1751,7 @@
               <w:rPr>
                 <w:noProof/>
               </w:rPr>
-              <w:instrText xml:space="preserve"> PAGEREF _Toc243245240 \h </w:instrText>
+              <w:instrText xml:space="preserve"> PAGEREF _Toc243245597 \h </w:instrText>
             </w:r>
             <w:r>
               <w:rPr>
@@ -1788,7 +1788,7 @@
               <w:noProof/>
             </w:rPr>
           </w:pPr>
-          <w:hyperlink w:anchor="_Toc243245241" w:history="1">
+          <w:hyperlink w:anchor="_Toc243245598" w:history="1">
             <w:r>
               <w:rPr>
                 <w:rStyle w:val="Hyperlink"/>
@@ -1812,7 +1812,7 @@
               <w:rPr>
                 <w:noProof/>
               </w:rPr>
-              <w:instrText xml:space="preserve"> PAGEREF _Toc243245241 \h </w:instrText>
+              <w:instrText xml:space="preserve"> PAGEREF _Toc243245598 \h </w:instrText>
             </w:r>
             <w:r>
               <w:rPr>
@@ -1849,7 +1849,7 @@
               <w:noProof/>
             </w:rPr>
           </w:pPr>
-          <w:hyperlink w:anchor="_Toc243245242" w:history="1">
+          <w:hyperlink w:anchor="_Toc243245599" w:history="1">
             <w:r>
               <w:rPr>
                 <w:rStyle w:val="Hyperlink"/>
@@ -1873,7 +1873,7 @@
               <w:rPr>
                 <w:noProof/>
               </w:rPr>
-              <w:instrText xml:space="preserve"> PAGEREF _Toc243245242 \h </w:instrText>
+              <w:instrText xml:space="preserve"> PAGEREF _Toc243245599 \h </w:instrText>
             </w:r>
             <w:r>
               <w:rPr>
@@ -1910,7 +1910,7 @@
               <w:noProof/>
             </w:rPr>
           </w:pPr>
-          <w:hyperlink w:anchor="_Toc243245243" w:history="1">
+          <w:hyperlink w:anchor="_Toc243245600" w:history="1">
             <w:r>
               <w:rPr>
                 <w:rStyle w:val="Hyperlink"/>
@@ -1934,7 +1934,7 @@
               <w:rPr>
                 <w:noProof/>
               </w:rPr>
-              <w:instrText xml:space="preserve"> PAGEREF _Toc243245243 \h </w:instrText>
+              <w:instrText xml:space="preserve"> PAGEREF _Toc243245600 \h </w:instrText>
             </w:r>
             <w:r>
               <w:rPr>
@@ -1971,7 +1971,7 @@
               <w:noProof/>
             </w:rPr>
           </w:pPr>
-          <w:hyperlink w:anchor="_Toc243245244" w:history="1">
+          <w:hyperlink w:anchor="_Toc243245601" w:history="1">
             <w:r>
               <w:rPr>
                 <w:rStyle w:val="Hyperlink"/>
@@ -1995,7 +1995,7 @@
               <w:rPr>
                 <w:noProof/>
               </w:rPr>
-              <w:instrText xml:space="preserve"> PAGEREF _Toc243245244 \h </w:instrText>
+              <w:instrText xml:space="preserve"> PAGEREF _Toc243245601 \h </w:instrText>
             </w:r>
             <w:r>
               <w:rPr>
@@ -2032,7 +2032,7 @@
               <w:noProof/>
             </w:rPr>
           </w:pPr>
-          <w:hyperlink w:anchor="_Toc243245245" w:history="1">
+          <w:hyperlink w:anchor="_Toc243245602" w:history="1">
             <w:r>
               <w:rPr>
                 <w:rStyle w:val="Hyperlink"/>
@@ -2056,7 +2056,7 @@
               <w:rPr>
                 <w:noProof/>
               </w:rPr>
-              <w:instrText xml:space="preserve"> PAGEREF _Toc243245245 \h </w:instrText>
+              <w:instrText xml:space="preserve"> PAGEREF _Toc243245602 \h </w:instrText>
             </w:r>
             <w:r>
               <w:rPr>
@@ -2093,7 +2093,7 @@
               <w:noProof/>
             </w:rPr>
           </w:pPr>
-          <w:hyperlink w:anchor="_Toc243245246" w:history="1">
+          <w:hyperlink w:anchor="_Toc243245603" w:history="1">
             <w:r>
               <w:rPr>
                 <w:rStyle w:val="Hyperlink"/>
@@ -2117,7 +2117,7 @@
               <w:rPr>
                 <w:noProof/>
               </w:rPr>
-              <w:instrText xml:space="preserve"> PAGEREF _Toc243245246 \h </w:instrText>
+              <w:instrText xml:space="preserve"> PAGEREF _Toc243245603 \h </w:instrText>
             </w:r>
             <w:r>
               <w:rPr>
@@ -2160,7 +2160,7 @@
       <w:pPr>
         <w:pStyle w:val="Ttulo1"/>
       </w:pPr>
-      <w:bookmarkStart w:id="0" w:name="_Toc243245216"/>
+      <w:bookmarkStart w:id="0" w:name="_Toc243245573"/>
       <w:r>
         <w:lastRenderedPageBreak/>
         <w:t>1. Apresentação</w:t>
@@ -2171,7 +2171,7 @@
       <w:pPr>
         <w:pStyle w:val="Ttulo2"/>
       </w:pPr>
-      <w:bookmarkStart w:id="1" w:name="_Toc243245217"/>
+      <w:bookmarkStart w:id="1" w:name="_Toc243245574"/>
       <w:r>
         <w:t>1.1 O que é esta apostila</w:t>
       </w:r>
@@ -2205,7 +2205,7 @@
       <w:pPr>
         <w:pStyle w:val="Ttulo2"/>
       </w:pPr>
-      <w:bookmarkStart w:id="2" w:name="_Toc243245218"/>
+      <w:bookmarkStart w:id="2" w:name="_Toc243245575"/>
       <w:r>
         <w:t>1.2 Como usar</w:t>
       </w:r>
@@ -2266,7 +2266,7 @@
       <w:pPr>
         <w:pStyle w:val="Ttulo2"/>
       </w:pPr>
-      <w:bookmarkStart w:id="3" w:name="_Toc243245219"/>
+      <w:bookmarkStart w:id="3" w:name="_Toc243245576"/>
       <w:r>
         <w:t>1.3 Como os painéis estão organizados</w:t>
       </w:r>
@@ -2557,7 +2557,7 @@
                 <w:sz w:val="20"/>
                 <w:szCs w:val="20"/>
               </w:rPr>
-              <w:t>Dossiê da unidade</w:t>
+              <w:t>Perfil da unidade</w:t>
             </w:r>
           </w:p>
         </w:tc>
@@ -2634,7 +2634,7 @@
                 <w:sz w:val="20"/>
                 <w:szCs w:val="20"/>
               </w:rPr>
-              <w:t>As tabelas do dossiê (chamadas blocos) e os quadros de perfil da mãe (chamados cards no código do painel).</w:t>
+              <w:t>As tabelas do perfil da unidade (chamadas blocos) e os quadros de perfil da mãe (chamados cards no código do painel).</w:t>
             </w:r>
           </w:p>
         </w:tc>
@@ -2914,7 +2914,7 @@
       <w:pPr>
         <w:pStyle w:val="Ttulo2"/>
       </w:pPr>
-      <w:bookmarkStart w:id="4" w:name="_Toc243245220"/>
+      <w:bookmarkStart w:id="4" w:name="_Toc243245577"/>
       <w:r>
         <w:t>1.4 Controle de versões</w:t>
       </w:r>
@@ -3477,6 +3477,107 @@
           </w:p>
         </w:tc>
       </w:tr>
+      <w:tr>
+        <w:tc>
+          <w:tcPr>
+            <w:tcW w:w="1200" w:type="dxa"/>
+            <w:shd w:val="clear" w:color="auto" w:fill="FFFFFF"/>
+            <w:tcMar>
+              <w:top w:w="60" w:type="dxa"/>
+              <w:left w:w="90" w:type="dxa"/>
+              <w:bottom w:w="60" w:type="dxa"/>
+              <w:right w:w="90" w:type="dxa"/>
+            </w:tcMar>
+          </w:tcPr>
+          <w:p>
+            <w:pPr>
+              <w:spacing w:after="60" w:line="252" w:lineRule="auto"/>
+            </w:pPr>
+            <w:r>
+              <w:rPr>
+                <w:b/>
+                <w:bCs/>
+                <w:color w:val="0A213D"/>
+                <w:sz w:val="20"/>
+                <w:szCs w:val="20"/>
+              </w:rPr>
+              <w:t>1.4</w:t>
+            </w:r>
+          </w:p>
+        </w:tc>
+        <w:tc>
+          <w:tcPr>
+            <w:tcW w:w="1800" w:type="dxa"/>
+            <w:shd w:val="clear" w:color="auto" w:fill="FFFFFF"/>
+            <w:tcMar>
+              <w:top w:w="60" w:type="dxa"/>
+              <w:left w:w="90" w:type="dxa"/>
+              <w:bottom w:w="60" w:type="dxa"/>
+              <w:right w:w="90" w:type="dxa"/>
+            </w:tcMar>
+          </w:tcPr>
+          <w:p>
+            <w:pPr>
+              <w:spacing w:after="60" w:line="252" w:lineRule="auto"/>
+            </w:pPr>
+            <w:r>
+              <w:rPr>
+                <w:sz w:val="20"/>
+                <w:szCs w:val="20"/>
+              </w:rPr>
+              <w:t>18/10/2026</w:t>
+            </w:r>
+          </w:p>
+        </w:tc>
+        <w:tc>
+          <w:tcPr>
+            <w:tcW w:w="4238" w:type="dxa"/>
+            <w:shd w:val="clear" w:color="auto" w:fill="FFFFFF"/>
+            <w:tcMar>
+              <w:top w:w="60" w:type="dxa"/>
+              <w:left w:w="90" w:type="dxa"/>
+              <w:bottom w:w="60" w:type="dxa"/>
+              <w:right w:w="90" w:type="dxa"/>
+            </w:tcMar>
+          </w:tcPr>
+          <w:p>
+            <w:pPr>
+              <w:spacing w:after="60" w:line="252" w:lineRule="auto"/>
+            </w:pPr>
+            <w:r>
+              <w:rPr>
+                <w:sz w:val="20"/>
+                <w:szCs w:val="20"/>
+              </w:rPr>
+              <w:t>A página de cada maternidade nos painéis, antes chamada "dossiê", passou a chamar-se "perfil da unidade", a pedido da coordenação; o termo foi atualizado nesta apostila. Nenhuma regra de cálculo mudou.</w:t>
+            </w:r>
+          </w:p>
+        </w:tc>
+        <w:tc>
+          <w:tcPr>
+            <w:tcW w:w="2400" w:type="dxa"/>
+            <w:shd w:val="clear" w:color="auto" w:fill="FFFFFF"/>
+            <w:tcMar>
+              <w:top w:w="60" w:type="dxa"/>
+              <w:left w:w="90" w:type="dxa"/>
+              <w:bottom w:w="60" w:type="dxa"/>
+              <w:right w:w="90" w:type="dxa"/>
+            </w:tcMar>
+          </w:tcPr>
+          <w:p>
+            <w:pPr>
+              <w:spacing w:after="60" w:line="252" w:lineRule="auto"/>
+            </w:pPr>
+            <w:r>
+              <w:rPr>
+                <w:sz w:val="20"/>
+                <w:szCs w:val="20"/>
+              </w:rPr>
+              <w:t>Coordenação (equipe dos painéis)</w:t>
+            </w:r>
+          </w:p>
+        </w:tc>
+      </w:tr>
     </w:tbl>
     <w:p>
       <w:pPr>
@@ -3495,7 +3596,7 @@
       <w:pPr>
         <w:pStyle w:val="Ttulo1"/>
       </w:pPr>
-      <w:bookmarkStart w:id="5" w:name="_Toc243245221"/>
+      <w:bookmarkStart w:id="5" w:name="_Toc243245578"/>
       <w:r>
         <w:t>2. Fontes de dados</w:t>
       </w:r>
@@ -3745,19 +3846,26 @@
                 <w:sz w:val="20"/>
                 <w:szCs w:val="20"/>
               </w:rPr>
-              <w:t>No Painel de Nascimentos, as séries por unidade e por território são tabuladas a partir desses microdados, segundo o estabelecimento de ocorrência (campo CODESTAB) e os municípios de residência e de ocorrência da mãe, com as categorias descritas na seção 4.5.</w:t>
-            </w:r>
-          </w:p>
-          <w:p>
-            <w:pPr>
-              <w:spacing w:after="60" w:line="252" w:lineRule="auto"/>
-            </w:pPr>
+              <w:t xml:space="preserve">No Painel de Nascimentos, as séries por unidade e por território são </w:t>
+            </w:r>
             <w:r>
               <w:rPr>
                 <w:sz w:val="20"/>
                 <w:szCs w:val="20"/>
               </w:rPr>
               <w:lastRenderedPageBreak/>
+              <w:t>tabuladas a partir desses microdados, segundo o estabelecimento de ocorrência (campo CODESTAB) e os municípios de residência e de ocorrência da mãe, com as categorias descritas na seção 4.5.</w:t>
+            </w:r>
+          </w:p>
+          <w:p>
+            <w:pPr>
+              <w:spacing w:after="60" w:line="252" w:lineRule="auto"/>
+            </w:pPr>
+            <w:r>
+              <w:rPr>
+                <w:sz w:val="20"/>
+                <w:szCs w:val="20"/>
+              </w:rPr>
               <w:t>No Painel de Mortalidade, o SINASC fornece os nascidos vivos usados como denominador. No Painel de Internação, fornece três indicadores calculados na DN: parto vaginal após cesariana, trabalho de parto induzido e condições potencialmente ameaçadoras à vida do recém-nascido. Os quadros de perfil da mãe estão no Painel de Nascimentos (seção 4.4).</w:t>
             </w:r>
           </w:p>
@@ -3783,7 +3891,7 @@
                 <w:szCs w:val="20"/>
               </w:rPr>
               <w:lastRenderedPageBreak/>
-              <w:t xml:space="preserve">2019 a 2025 e 1º semestre de 2026 (nascidos de janeiro a junho de 2026, do arquivo preliminar de 2026 do OpenDataSUS, extraídos em 18/10/2026). No Painel de Nascimentos e no de Internação, </w:t>
+              <w:t xml:space="preserve">2019 a 2025 e 1º semestre de 2026 (nascidos de janeiro a junho de 2026, do arquivo preliminar de 2026 do </w:t>
             </w:r>
             <w:r>
               <w:rPr>
@@ -3791,7 +3899,7 @@
                 <w:szCs w:val="20"/>
               </w:rPr>
               <w:lastRenderedPageBreak/>
-              <w:t>2025 é preliminar; no Painel de Mortalidade, 2024 e 2025 recebem a marca de preliminar (seção 7.3).</w:t>
+              <w:t>OpenDataSUS, extraídos em 18/10/2026). No Painel de Nascimentos e no de Internação, 2025 é preliminar; no Painel de Mortalidade, 2024 e 2025 recebem a marca de preliminar (seção 7.3).</w:t>
             </w:r>
           </w:p>
           <w:p>
@@ -4155,7 +4263,15 @@
                 <w:sz w:val="20"/>
                 <w:szCs w:val="20"/>
               </w:rPr>
-              <w:t>2019 a 2025; extração em 10 e 11/09/2026 e, para as unidades acrescentadas, em 23/09/2026. 1º semestre de 2026: óbitos de janeiro a junho de 2026, dos arquivos preliminares de 2026 (28/09/2026), extraídos em 18/10/2026.</w:t>
+              <w:t xml:space="preserve">2019 a 2025; extração em 10 e 11/09/2026 e, para as unidades acrescentadas, em 23/09/2026. 1º semestre de 2026: óbitos de janeiro a junho de 2026, dos arquivos preliminares de 2026 (28/09/2026), </w:t>
+            </w:r>
+            <w:r>
+              <w:rPr>
+                <w:sz w:val="20"/>
+                <w:szCs w:val="20"/>
+              </w:rPr>
+              <w:lastRenderedPageBreak/>
+              <w:t>extraídos em 18/10/2026.</w:t>
             </w:r>
           </w:p>
           <w:p>
@@ -4296,7 +4412,7 @@
       <w:pPr>
         <w:pStyle w:val="Ttulo1"/>
       </w:pPr>
-      <w:bookmarkStart w:id="6" w:name="_Toc243245222"/>
+      <w:bookmarkStart w:id="6" w:name="_Toc243245579"/>
       <w:r>
         <w:t>3. Unidades e grupos</w:t>
       </w:r>
@@ -4306,7 +4422,7 @@
       <w:pPr>
         <w:pStyle w:val="Ttulo2"/>
       </w:pPr>
-      <w:bookmarkStart w:id="7" w:name="_Toc243245223"/>
+      <w:bookmarkStart w:id="7" w:name="_Toc243245580"/>
       <w:r>
         <w:t>3.1 Os três grupos de maternidades</w:t>
       </w:r>
@@ -4917,7 +5033,6 @@
           <w:b/>
           <w:bCs/>
         </w:rPr>
-        <w:lastRenderedPageBreak/>
         <w:t xml:space="preserve">Painel de Internação (119 unidades): </w:t>
       </w:r>
       <w:r>
@@ -4976,7 +5091,7 @@
       <w:pPr>
         <w:pStyle w:val="Ttulo2"/>
       </w:pPr>
-      <w:bookmarkStart w:id="8" w:name="_Toc243245224"/>
+      <w:bookmarkStart w:id="8" w:name="_Toc243245581"/>
       <w:r>
         <w:t>3.2 A coluna de referência do comparador em cada painel</w:t>
       </w:r>
@@ -5080,6 +5195,7 @@
           <w:b/>
           <w:bCs/>
         </w:rPr>
+        <w:lastRenderedPageBreak/>
         <w:t xml:space="preserve">Só o próprio grupo: </w:t>
       </w:r>
       <w:r>
@@ -5111,7 +5227,6 @@
         <w:spacing w:after="120" w:line="276" w:lineRule="auto"/>
       </w:pPr>
       <w:r>
-        <w:lastRenderedPageBreak/>
         <w:t>Exemplo da nota: em 2025, as 25 unidades do grupo EBSERH com dados somaram 28.638 partos cesáreos em 50.084 nascidos vivos com via de nascimento informada, o que resulta em 57,2% de cesárea para o grupo. Uma unidade com 64,4% aparece 7,2 pontos percentuais acima da média do seu grupo.</w:t>
       </w:r>
     </w:p>
@@ -5154,7 +5269,7 @@
       <w:pPr>
         <w:pStyle w:val="Ttulo1"/>
       </w:pPr>
-      <w:bookmarkStart w:id="9" w:name="_Toc243245225"/>
+      <w:bookmarkStart w:id="9" w:name="_Toc243245582"/>
       <w:r>
         <w:t>4. Dicionário do Painel de Nascimentos (SINASC)</w:t>
       </w:r>
@@ -5180,7 +5295,7 @@
       <w:pPr>
         <w:pStyle w:val="Ttulo2"/>
       </w:pPr>
-      <w:bookmarkStart w:id="10" w:name="_Toc243245226"/>
+      <w:bookmarkStart w:id="10" w:name="_Toc243245583"/>
       <w:r>
         <w:t>4.1 Bases usadas pelo painel</w:t>
       </w:r>
@@ -5207,6 +5322,7 @@
           <w:sz w:val="20"/>
           <w:szCs w:val="20"/>
         </w:rPr>
+        <w:lastRenderedPageBreak/>
         <w:t>Tabela 5 – Usos específicos de bases no Painel de Nascimentos</w:t>
       </w:r>
     </w:p>
@@ -5442,15 +5558,7 @@
                 <w:sz w:val="20"/>
                 <w:szCs w:val="20"/>
               </w:rPr>
-              <w:t xml:space="preserve">Microdados públicos do SINASC (OpenDataSUS), série 2019-2025, processados por território de residência e ocorrência: todos os nascidos vivos e &lt;1500 g, por região de </w:t>
-            </w:r>
-            <w:r>
-              <w:rPr>
-                <w:sz w:val="20"/>
-                <w:szCs w:val="20"/>
-              </w:rPr>
-              <w:lastRenderedPageBreak/>
-              <w:t>saúde, macro e UF. Nos níveis macro e UF, o percentual agrega os nascidos na própria região de saúde (todos) ou na própria macro (&lt;1500 g), como nas planilhas oficiais. 2025 preliminar. Extração validada contra as planilhas NV por Região e NV por Macro (2019 e 2024).</w:t>
+              <w:t>Microdados públicos do SINASC (OpenDataSUS), série 2019-2025, processados por território de residência e ocorrência: todos os nascidos vivos e &lt;1500 g, por região de saúde, macro e UF. Nos níveis macro e UF, o percentual agrega os nascidos na própria região de saúde (todos) ou na própria macro (&lt;1500 g), como nas planilhas oficiais. 2025 preliminar. Extração validada contra as planilhas NV por Região e NV por Macro (2019 e 2024).</w:t>
             </w:r>
           </w:p>
         </w:tc>
@@ -5479,7 +5587,6 @@
                 <w:sz w:val="20"/>
                 <w:szCs w:val="20"/>
               </w:rPr>
-              <w:lastRenderedPageBreak/>
               <w:t>Localização das unidades</w:t>
             </w:r>
           </w:p>
@@ -5519,7 +5626,7 @@
       <w:pPr>
         <w:pStyle w:val="Ttulo2"/>
       </w:pPr>
-      <w:bookmarkStart w:id="11" w:name="_Toc243245227"/>
+      <w:bookmarkStart w:id="11" w:name="_Toc243245584"/>
       <w:r>
         <w:t>4.2 Indicadores dos mapas e do comparador</w:t>
       </w:r>
@@ -6185,7 +6292,15 @@
                 <w:sz w:val="20"/>
                 <w:szCs w:val="20"/>
               </w:rPr>
-              <w:t>Nascidos vivos totais, excluídos os registros com número de consultas ignorado.</w:t>
+              <w:t xml:space="preserve">Nascidos vivos totais, excluídos os registros com </w:t>
+            </w:r>
+            <w:r>
+              <w:rPr>
+                <w:sz w:val="20"/>
+                <w:szCs w:val="20"/>
+              </w:rPr>
+              <w:lastRenderedPageBreak/>
+              <w:t>número de consultas ignorado.</w:t>
             </w:r>
           </w:p>
         </w:tc>
@@ -6209,6 +6324,7 @@
                 <w:sz w:val="20"/>
                 <w:szCs w:val="20"/>
               </w:rPr>
+              <w:lastRenderedPageBreak/>
               <w:t>Quanto maior, melhor.</w:t>
             </w:r>
           </w:p>
@@ -6375,7 +6491,6 @@
                 <w:sz w:val="20"/>
                 <w:szCs w:val="20"/>
               </w:rPr>
-              <w:lastRenderedPageBreak/>
               <w:t>% de cesárea</w:t>
             </w:r>
           </w:p>
@@ -7162,7 +7277,15 @@
                 <w:sz w:val="20"/>
                 <w:szCs w:val="20"/>
               </w:rPr>
-              <w:t>Nulíparas, feto único cefálico, ≥37 semanas, trabalho de parto espontâneo. Meta ≤10%.</w:t>
+              <w:t xml:space="preserve">Nulíparas, feto único cefálico, ≥37 semanas, trabalho de parto </w:t>
+            </w:r>
+            <w:r>
+              <w:rPr>
+                <w:sz w:val="20"/>
+                <w:szCs w:val="20"/>
+              </w:rPr>
+              <w:lastRenderedPageBreak/>
+              <w:t>espontâneo. Meta ≤10%.</w:t>
             </w:r>
           </w:p>
         </w:tc>
@@ -7186,6 +7309,7 @@
                 <w:sz w:val="20"/>
                 <w:szCs w:val="20"/>
               </w:rPr>
+              <w:lastRenderedPageBreak/>
               <w:t>Partos cesáreos do grupo 1 de Robson.</w:t>
             </w:r>
           </w:p>
@@ -7246,6 +7370,7 @@
                 <w:sz w:val="20"/>
                 <w:szCs w:val="20"/>
               </w:rPr>
+              <w:lastRenderedPageBreak/>
               <w:t>Valor de referência do painel: até 10%.</w:t>
             </w:r>
           </w:p>
@@ -7275,6 +7400,7 @@
                 <w:sz w:val="20"/>
                 <w:szCs w:val="20"/>
               </w:rPr>
+              <w:lastRenderedPageBreak/>
               <w:t>Taxa de cesárea no grupo 2 de Robson</w:t>
             </w:r>
           </w:p>
@@ -7412,7 +7538,6 @@
                 <w:sz w:val="20"/>
                 <w:szCs w:val="20"/>
               </w:rPr>
-              <w:lastRenderedPageBreak/>
               <w:t>Taxa de cesárea no grupo 3 de Robson</w:t>
             </w:r>
           </w:p>
@@ -7803,7 +7928,7 @@
       <w:pPr>
         <w:pStyle w:val="Ttulo2"/>
       </w:pPr>
-      <w:bookmarkStart w:id="12" w:name="_Toc243245228"/>
+      <w:bookmarkStart w:id="12" w:name="_Toc243245585"/>
       <w:r>
         <w:t>4.3 Demais cálculos do painel</w:t>
       </w:r>
@@ -7814,7 +7939,7 @@
         <w:spacing w:after="120" w:line="276" w:lineRule="auto"/>
       </w:pPr>
       <w:r>
-        <w:t>Esta seção reúne os cálculos que não são indicadores do mapa, mas aparecem no dossiê da unidade, no comparativo entre anos e no comparador.</w:t>
+        <w:t>Esta seção reúne os cálculos que não são indicadores do mapa, mas aparecem no perfil da unidade, no comparativo entre anos e no comparador.</w:t>
       </w:r>
     </w:p>
     <w:p>
@@ -8022,7 +8147,7 @@
                 <w:sz w:val="20"/>
                 <w:szCs w:val="20"/>
               </w:rPr>
-              <w:t>% Residentes no município / região de saúde / macro / UF (dossiê, perspectiva Local de residência)</w:t>
+              <w:t>% Residentes no município / região de saúde / macro / UF (perfil da unidade, perspectiva Local de residência)</w:t>
             </w:r>
           </w:p>
         </w:tc>
@@ -8118,7 +8243,7 @@
                 <w:sz w:val="20"/>
                 <w:szCs w:val="20"/>
               </w:rPr>
-              <w:t>Ministério da Saúde – SINASC, 2019 a 2025. Também calculado para os nascidos vivos &lt;1500 g.</w:t>
+              <w:t xml:space="preserve">Ministério da Saúde – SINASC, </w:t>
             </w:r>
           </w:p>
         </w:tc>
@@ -8147,7 +8272,18 @@
                 <w:sz w:val="20"/>
                 <w:szCs w:val="20"/>
               </w:rPr>
-              <w:t>% Município / região de saúde / macro / UF (dossiê, perspectiva Local de ocorrência)</w:t>
+              <w:t xml:space="preserve">% Município / região de saúde / macro / UF (perfil da unidade, </w:t>
+            </w:r>
+            <w:r>
+              <w:rPr>
+                <w:b/>
+                <w:bCs/>
+                <w:color w:val="0A213D"/>
+                <w:sz w:val="20"/>
+                <w:szCs w:val="20"/>
+              </w:rPr>
+              <w:lastRenderedPageBreak/>
+              <w:t>perspectiva Local de ocorrência)</w:t>
             </w:r>
           </w:p>
         </w:tc>
@@ -8171,7 +8307,16 @@
                 <w:sz w:val="20"/>
                 <w:szCs w:val="20"/>
               </w:rPr>
-              <w:t>De todos os nascimentos que acontecem em cada território, quantos ocorrem dentro da maternidade.</w:t>
+              <w:lastRenderedPageBreak/>
+              <w:t xml:space="preserve">De todos os nascimentos que acontecem em cada </w:t>
+            </w:r>
+            <w:r>
+              <w:rPr>
+                <w:sz w:val="20"/>
+                <w:szCs w:val="20"/>
+              </w:rPr>
+              <w:lastRenderedPageBreak/>
+              <w:t>território, quantos ocorrem dentro da maternidade.</w:t>
             </w:r>
           </w:p>
         </w:tc>
@@ -8195,6 +8340,7 @@
                 <w:sz w:val="20"/>
                 <w:szCs w:val="20"/>
               </w:rPr>
+              <w:lastRenderedPageBreak/>
               <w:t>Nascidos vivos ocorridos na maternidade.</w:t>
             </w:r>
           </w:p>
@@ -8219,7 +8365,15 @@
                 <w:sz w:val="20"/>
                 <w:szCs w:val="20"/>
               </w:rPr>
-              <w:t>Nascidos vivos ocorridos no território (município, região de saúde, macro ou UF).</w:t>
+              <w:t xml:space="preserve">Nascidos vivos ocorridos no território </w:t>
+            </w:r>
+            <w:r>
+              <w:rPr>
+                <w:sz w:val="20"/>
+                <w:szCs w:val="20"/>
+              </w:rPr>
+              <w:lastRenderedPageBreak/>
+              <w:t>(município, região de saúde, macro ou UF).</w:t>
             </w:r>
           </w:p>
         </w:tc>
@@ -8243,7 +8397,8 @@
                 <w:sz w:val="20"/>
                 <w:szCs w:val="20"/>
               </w:rPr>
-              <w:t>Ministério da Saúde – SINASC, 2019 a 2025. Também calculado para os nascidos vivos &lt;1500 g.</w:t>
+              <w:lastRenderedPageBreak/>
+              <w:t xml:space="preserve">Ministério da Saúde – SINASC, </w:t>
             </w:r>
           </w:p>
         </w:tc>
@@ -8272,7 +8427,7 @@
                 <w:sz w:val="20"/>
                 <w:szCs w:val="20"/>
               </w:rPr>
-              <w:t>% Primeiro Trimestre (tabela de trimestre do dossiê)</w:t>
+              <w:t>% Primeiro Trimestre (tabela de trimestre do perfil da unidade)</w:t>
             </w:r>
           </w:p>
         </w:tc>
@@ -8344,15 +8499,7 @@
                 <w:sz w:val="20"/>
                 <w:szCs w:val="20"/>
               </w:rPr>
-              <w:t xml:space="preserve">Total de nascidos vivos com ao menos uma consulta, incluindo os registros com trimestre ignorado </w:t>
-            </w:r>
-            <w:r>
-              <w:rPr>
-                <w:sz w:val="20"/>
-                <w:szCs w:val="20"/>
-              </w:rPr>
-              <w:lastRenderedPageBreak/>
-              <w:t>(por isso pode diferir do indicador "% com pré-natal iniciado no 1º trimestre" dos mapas, que exclui os ignorados).</w:t>
+              <w:t>Total de nascidos vivos com ao menos uma consulta, incluindo os registros com trimestre ignorado (por isso pode diferir do indicador "% com pré-natal iniciado no 1º trimestre" dos mapas, que exclui os ignorados).</w:t>
             </w:r>
           </w:p>
         </w:tc>
@@ -8376,8 +8523,7 @@
                 <w:sz w:val="20"/>
                 <w:szCs w:val="20"/>
               </w:rPr>
-              <w:lastRenderedPageBreak/>
-              <w:t>Ministério da Saúde – SINASC, 2019 a 2025.</w:t>
+              <w:t xml:space="preserve">Ministério da Saúde – SINASC, </w:t>
             </w:r>
           </w:p>
         </w:tc>
@@ -8531,7 +8677,7 @@
                 <w:sz w:val="20"/>
                 <w:szCs w:val="20"/>
               </w:rPr>
-              <w:t>Participação da unidade nos nascimentos da UF e do Brasil (topo do dossiê)</w:t>
+              <w:t>Participação da unidade nos nascimentos da UF e do Brasil (topo do perfil da unidade)</w:t>
             </w:r>
           </w:p>
         </w:tc>
@@ -8579,7 +8725,7 @@
                 <w:sz w:val="20"/>
                 <w:szCs w:val="20"/>
               </w:rPr>
-              <w:t>Nascidos vivos ocorridos na unidade em 2025.</w:t>
+              <w:t xml:space="preserve">Nascidos vivos ocorridos na unidade em </w:t>
             </w:r>
           </w:p>
         </w:tc>
@@ -8627,7 +8773,7 @@
                 <w:sz w:val="20"/>
                 <w:szCs w:val="20"/>
               </w:rPr>
-              <w:t>Ministério da Saúde – SINASC, 2025.</w:t>
+              <w:t xml:space="preserve">Ministério da Saúde – SINASC, </w:t>
             </w:r>
           </w:p>
         </w:tc>
@@ -8680,7 +8826,7 @@
                 <w:sz w:val="20"/>
                 <w:szCs w:val="20"/>
               </w:rPr>
-              <w:t xml:space="preserve">Coluna de referência do comparador de unidades: a maternidade é comparada com a média do seu próprio grupo — maternidades estratégicas, unidades EBSERH ou QUALINEO 2026/2027. Nos indicadores percentuais a média é a taxa agregada do grupo (soma dos numeradores dividida pela soma dos denominadores de todas as unidades do grupo, com as mesmas exclusões de ignorados </w:t>
+              <w:t xml:space="preserve">Coluna de referência do comparador de unidades: a maternidade é comparada com a média do seu próprio grupo — maternidades estratégicas, unidades EBSERH ou QUALINEO 2026/2027. Nos </w:t>
             </w:r>
             <w:r>
               <w:rPr>
@@ -8688,7 +8834,14 @@
                 <w:szCs w:val="20"/>
               </w:rPr>
               <w:lastRenderedPageBreak/>
-              <w:t>de cada indicador), a mesma regra de agregação usada nos mapas e no panorama; nos grupos de Robson, a taxa agregada é ponderada pelo número de partos de cada unidade no grupo. No volume de nascidos vivos, mostra-se a média por unidade (total do grupo dividido pelo número de unidades com dado no ano). Unidades que pertencem a mais de um grupo contam na média de todos os grupos a que pertencem. A média do grupo não participa do destaque de melhor posição.</w:t>
+              <w:t>indicadores percentuais a média é a taxa agregada do grupo (soma dos numeradores dividida pela soma dos denominadores de todas as unidades do grupo, com as mesmas exclusões de ignorados de cada indicador), a mesma regra de agregação usada nos mapas e no panorama; nos grupos de Robson, a taxa agregada é ponderada pelo número de partos de cada unidade no grupo. No volume de nascidos vivos, mostra-se a média por unidade (total do grupo dividido pelo número de unidades com dado no ano). Unidades que pertencem a</w:t>
+            </w:r>
+            <w:r>
+              <w:rPr>
+                <w:sz w:val="20"/>
+                <w:szCs w:val="20"/>
+              </w:rPr>
+              <w:t xml:space="preserve"> mais de um grupo contam na média de todos os grupos a que pertencem. A média do grupo não participa do destaque de melhor posição.</w:t>
             </w:r>
           </w:p>
         </w:tc>
@@ -8761,7 +8914,7 @@
                 <w:sz w:val="20"/>
                 <w:szCs w:val="20"/>
               </w:rPr>
-              <w:t>Ministério da Saúde – SINASC, 2019 a 2025.</w:t>
+              <w:t xml:space="preserve">Ministério da Saúde – SINASC, </w:t>
             </w:r>
           </w:p>
         </w:tc>
@@ -8776,9 +8929,9 @@
       <w:pPr>
         <w:pStyle w:val="Ttulo2"/>
       </w:pPr>
-      <w:bookmarkStart w:id="13" w:name="_Toc243245229"/>
+      <w:bookmarkStart w:id="13" w:name="_Toc243245586"/>
       <w:r>
-        <w:t>4.4 Perfil da mãe (quadros do dossiê)</w:t>
+        <w:t>4.4 Perfil da mãe (quadros do perfil da unidade)</w:t>
       </w:r>
       <w:bookmarkEnd w:id="13"/>
     </w:p>
@@ -8811,6 +8964,7 @@
           <w:sz w:val="20"/>
           <w:szCs w:val="20"/>
         </w:rPr>
+        <w:lastRenderedPageBreak/>
         <w:t>Tabela 8 – Perfil sociodemográfico (SINASC): indicadores e regras</w:t>
       </w:r>
     </w:p>
@@ -9106,15 +9260,7 @@
                 <w:sz w:val="20"/>
                 <w:szCs w:val="20"/>
               </w:rPr>
-              <w:t xml:space="preserve">RACACORMAE: 1 Branca, 2 Preta, 3 Amarela, 4 Parda, 5 Indígena. Campo em branco = "Ignorado", </w:t>
-            </w:r>
-            <w:r>
-              <w:rPr>
-                <w:sz w:val="20"/>
-                <w:szCs w:val="20"/>
-              </w:rPr>
-              <w:lastRenderedPageBreak/>
-              <w:t>apresentado como categoria própria (a Declaração de Nascido Vivo não tem a opção "ignorado").</w:t>
+              <w:t>RACACORMAE: 1 Branca, 2 Preta, 3 Amarela, 4 Parda, 5 Indígena. Campo em branco = "Ignorado", apresentado como categoria própria (a Declaração de Nascido Vivo não tem a opção "ignorado").</w:t>
             </w:r>
           </w:p>
           <w:p>
@@ -9155,7 +9301,6 @@
                 <w:sz w:val="20"/>
                 <w:szCs w:val="20"/>
               </w:rPr>
-              <w:lastRenderedPageBreak/>
               <w:t>Distribuição percentual dos nascidos vivos por escolaridade da mãe</w:t>
             </w:r>
           </w:p>
@@ -9567,7 +9712,15 @@
                 <w:sz w:val="20"/>
                 <w:szCs w:val="20"/>
               </w:rPr>
-              <w:t>Título alterado de "partos anteriores" para "gestações anteriores" (decisão da coordenação, 09/09/2026): a variável QTDGESTANT conta gestações. O rótulo será atualizado em conjunto na planilha, no painel e nas apresentações.</w:t>
+              <w:t xml:space="preserve">Título alterado de "partos anteriores" para "gestações anteriores" (decisão da coordenação, 09/09/2026): a variável QTDGESTANT conta </w:t>
+            </w:r>
+            <w:r>
+              <w:rPr>
+                <w:sz w:val="20"/>
+                <w:szCs w:val="20"/>
+              </w:rPr>
+              <w:lastRenderedPageBreak/>
+              <w:t>gestações. O rótulo será atualizado em conjunto na planilha, no painel e nas apresentações.</w:t>
             </w:r>
           </w:p>
         </w:tc>
@@ -9596,6 +9749,7 @@
                 <w:sz w:val="20"/>
                 <w:szCs w:val="20"/>
               </w:rPr>
+              <w:lastRenderedPageBreak/>
               <w:t>Distribuição percentual dos nascidos vivos por número de cesarianas anteriores da mãe</w:t>
             </w:r>
           </w:p>
@@ -9697,7 +9851,6 @@
                 <w:sz w:val="20"/>
                 <w:szCs w:val="20"/>
               </w:rPr>
-              <w:lastRenderedPageBreak/>
               <w:t>Distribuição percentual dos nascidos vivos por tipo de gestação</w:t>
             </w:r>
           </w:p>
@@ -9879,9 +10032,9 @@
       <w:pPr>
         <w:pStyle w:val="Ttulo2"/>
       </w:pPr>
-      <w:bookmarkStart w:id="14" w:name="_Toc243245230"/>
+      <w:bookmarkStart w:id="14" w:name="_Toc243245587"/>
       <w:r>
-        <w:t>4.5 Tabelas do dossiê (blocos de nascidos vivos)</w:t>
+        <w:t>4.5 Tabelas do perfil da unidade (blocos de nascidos vivos)</w:t>
       </w:r>
       <w:bookmarkEnd w:id="14"/>
     </w:p>
@@ -9890,7 +10043,7 @@
         <w:spacing w:after="120" w:line="276" w:lineRule="auto"/>
       </w:pPr>
       <w:r>
-        <w:t>As tabelas do dossiê reproduzem a apresentação de cada maternidade. As categorias de cada tabela seguem as variáveis da Declaração de Nascido Vivo, conforme a Estrutura do SINASC (Ministério da Saúde, versão de 22/02/2024), e as faixas adotadas nas apresentações oficiais das maternidades. A tabela abaixo resume a variável do SINASC e as categorias de cada bloco.</w:t>
+        <w:t>As tabelas do perfil da unidade reproduzem a apresentação de cada maternidade. As categorias de cada tabela seguem as variáveis da Declaração de Nascido Vivo, conforme a Estrutura do SINASC (Ministério da Saúde, versão de 22/02/2024), e as faixas adotadas nas apresentações oficiais das maternidades. A tabela abaixo resume a variável do SINASC e as categorias de cada bloco.</w:t>
       </w:r>
     </w:p>
     <w:p>
@@ -9906,7 +10059,7 @@
           <w:sz w:val="20"/>
           <w:szCs w:val="20"/>
         </w:rPr>
-        <w:t>Tabela 10 – Variáveis e categorias das tabelas do dossiê de nascimentos</w:t>
+        <w:t>Tabela 10 – Variáveis e categorias das tabelas do perfil da unidade no Painel de Nascimentos</w:t>
       </w:r>
     </w:p>
     <w:tbl>
@@ -9955,7 +10108,7 @@
                 <w:sz w:val="20"/>
                 <w:szCs w:val="20"/>
               </w:rPr>
-              <w:t>Tabela do dossiê</w:t>
+              <w:t>Tabela do perfil da unidade</w:t>
             </w:r>
           </w:p>
         </w:tc>
@@ -10194,6 +10347,7 @@
                 <w:sz w:val="20"/>
                 <w:szCs w:val="20"/>
               </w:rPr>
+              <w:lastRenderedPageBreak/>
               <w:t>Consultas de pré-natal</w:t>
             </w:r>
           </w:p>
@@ -10502,7 +10656,6 @@
                 <w:sz w:val="20"/>
                 <w:szCs w:val="20"/>
               </w:rPr>
-              <w:lastRenderedPageBreak/>
               <w:t>Via de nascimento</w:t>
             </w:r>
           </w:p>
@@ -10812,7 +10965,7 @@
       <w:pPr>
         <w:pStyle w:val="Ttulo2"/>
       </w:pPr>
-      <w:bookmarkStart w:id="15" w:name="_Toc243245231"/>
+      <w:bookmarkStart w:id="15" w:name="_Toc243245588"/>
       <w:r>
         <w:t>4.6 Grupos de Robson</w:t>
       </w:r>
@@ -10839,6 +10992,7 @@
           <w:sz w:val="20"/>
           <w:szCs w:val="20"/>
         </w:rPr>
+        <w:lastRenderedPageBreak/>
         <w:t>Tabela 11 – Grupos de Robson: definições da OMS (2015) e valores de referência do manual de implementação da OMS (2017)</w:t>
       </w:r>
     </w:p>
@@ -11204,7 +11358,6 @@
                 <w:sz w:val="20"/>
                 <w:szCs w:val="20"/>
               </w:rPr>
-              <w:lastRenderedPageBreak/>
               <w:t>Grupo 4</w:t>
             </w:r>
           </w:p>
@@ -11758,6 +11911,7 @@
           <w:b/>
           <w:bCs/>
         </w:rPr>
+        <w:lastRenderedPageBreak/>
         <w:t xml:space="preserve">Duas observações de leitura. </w:t>
       </w:r>
       <w:r>
@@ -11768,7 +11922,7 @@
       <w:pPr>
         <w:pStyle w:val="Ttulo1"/>
       </w:pPr>
-      <w:bookmarkStart w:id="16" w:name="_Toc243245232"/>
+      <w:bookmarkStart w:id="16" w:name="_Toc243245589"/>
       <w:r>
         <w:t>5. Dicionário do Painel de Internação (SIH/SUS)</w:t>
       </w:r>
@@ -11779,7 +11933,6 @@
         <w:spacing w:after="120" w:line="276" w:lineRule="auto"/>
       </w:pPr>
       <w:r>
-        <w:lastRenderedPageBreak/>
         <w:t>As regras desta seção são as do Dicionário de indicadores de internação (AIH) do grupo de maternidades, versão final de 10/09/2026. Essa versão consolida as decisões da coordenação tomadas entre 30 de agosto e 9 de setembro de 2026 e substitui as versões anteriores, de 2 e de 7 de setembro de 2026. É a versão aplicada aos indicadores publicados no painel e nas apresentações de setembro de 2026.</w:t>
       </w:r>
     </w:p>
@@ -12134,7 +12287,15 @@
                 <w:sz w:val="20"/>
                 <w:szCs w:val="20"/>
               </w:rPr>
-              <w:t>Parto — vaginal: 0310010039, 0310010047, 0310010055 e 0409060313 (laqueadura tubária na mesma internação do parto normal; Portaria SAES/MS 1.549/2024, vigente desde a competência 04/2024; decisão da coordenação, 09/09/2026: é parto vaginal em todas as listas); cesariana: 0411010026, 0411010034, 0411010042.</w:t>
+              <w:t xml:space="preserve">Parto — vaginal: 0310010039, 0310010047, 0310010055 e 0409060313 (laqueadura tubária na </w:t>
+            </w:r>
+            <w:r>
+              <w:rPr>
+                <w:sz w:val="20"/>
+                <w:szCs w:val="20"/>
+              </w:rPr>
+              <w:lastRenderedPageBreak/>
+              <w:t>mesma internação do parto normal; Portaria SAES/MS 1.549/2024, vigente desde a competência 04/2024; decisão da coordenação, 09/09/2026: é parto vaginal em todas as listas); cesariana: 0411010026, 0411010034, 0411010042.</w:t>
             </w:r>
           </w:p>
           <w:p>
@@ -12158,7 +12319,6 @@
                 <w:sz w:val="20"/>
                 <w:szCs w:val="20"/>
               </w:rPr>
-              <w:lastRenderedPageBreak/>
               <w:t>Outros: demais procedimentos.</w:t>
             </w:r>
           </w:p>
@@ -12487,7 +12647,15 @@
                 <w:sz w:val="20"/>
                 <w:szCs w:val="20"/>
               </w:rPr>
-              <w:t>A curetagem semiótica (0409060046) NÃO entra no denominador: no SIGTAP ela só tem CIDs ginecológicos e não é esvaziamento pós-abortamento (decisão da coordenação, 09/09/2026).</w:t>
+              <w:t>A curetagem semiótica (0409060046) NÃO entra no denominador: no SIGTAP ela só tem CIDs ginecológicos e não é esvaziamento pós-</w:t>
+            </w:r>
+            <w:r>
+              <w:rPr>
+                <w:sz w:val="20"/>
+                <w:szCs w:val="20"/>
+              </w:rPr>
+              <w:lastRenderedPageBreak/>
+              <w:t>abortamento (decisão da coordenação, 09/09/2026).</w:t>
             </w:r>
           </w:p>
         </w:tc>
@@ -12516,6 +12684,7 @@
                 <w:sz w:val="20"/>
                 <w:szCs w:val="20"/>
               </w:rPr>
+              <w:lastRenderedPageBreak/>
               <w:t>Porcentagem de internações que resultaram em parto com presença de acompanhante</w:t>
             </w:r>
           </w:p>
@@ -12588,15 +12757,7 @@
                 <w:sz w:val="20"/>
                 <w:szCs w:val="20"/>
               </w:rPr>
-              <w:t xml:space="preserve">Base: Lei 11.108/2005; Portaria GM/MS 2.418/2005 (autoriza a cobrança das despesas com acompanhante na AIH); Portaria GM/MS 1.459/2011, art. 7º. Limitação: DIAR_ACOM </w:t>
-            </w:r>
-            <w:r>
-              <w:rPr>
-                <w:sz w:val="20"/>
-                <w:szCs w:val="20"/>
-              </w:rPr>
-              <w:lastRenderedPageBreak/>
-              <w:t>registra diárias faturadas, não a presença durante o trabalho de parto.</w:t>
+              <w:t>Base: Lei 11.108/2005; Portaria GM/MS 2.418/2005 (autoriza a cobrança das despesas com acompanhante na AIH); Portaria GM/MS 1.459/2011, art. 7º. Limitação: DIAR_ACOM registra diárias faturadas, não a presença durante o trabalho de parto.</w:t>
             </w:r>
           </w:p>
         </w:tc>
@@ -12625,7 +12786,6 @@
                 <w:sz w:val="20"/>
                 <w:szCs w:val="20"/>
               </w:rPr>
-              <w:lastRenderedPageBreak/>
               <w:t>Porcentagem de internações para assistência ao parto vaginal com presença de acompanhante</w:t>
             </w:r>
           </w:p>
@@ -13054,7 +13214,15 @@
                 <w:sz w:val="20"/>
                 <w:szCs w:val="20"/>
               </w:rPr>
-              <w:t>Denominador: leitos-dia do ano — soma, nas 12 competências, de leitos obstétricos EXISTENTES (QT_EXIST, CODLEITO 10 e 43) × dias do mês —, normalizado para ano de 365 dias (em anos bissextos, ajuste 365/366).</w:t>
+              <w:t xml:space="preserve">Denominador: leitos-dia do ano — soma, nas 12 competências, de leitos obstétricos EXISTENTES (QT_EXIST, CODLEITO 10 e 43) × dias do mês —, </w:t>
+            </w:r>
+            <w:r>
+              <w:rPr>
+                <w:sz w:val="20"/>
+                <w:szCs w:val="20"/>
+              </w:rPr>
+              <w:lastRenderedPageBreak/>
+              <w:t>normalizado para ano de 365 dias (em anos bissextos, ajuste 365/366).</w:t>
             </w:r>
           </w:p>
           <w:p>
@@ -13095,6 +13263,7 @@
                 <w:sz w:val="20"/>
                 <w:szCs w:val="20"/>
               </w:rPr>
+              <w:lastRenderedPageBreak/>
               <w:t>Tempo médio de permanência (geral, parto vaginal, cesariana, aborto, intercorrências clínicas)</w:t>
             </w:r>
           </w:p>
@@ -13155,15 +13324,7 @@
                 <w:sz w:val="20"/>
                 <w:szCs w:val="20"/>
               </w:rPr>
-              <w:t xml:space="preserve">TMP = soma de DIAS_PERM / número de AIH, no geral e por grupo (Parto Vaginal, Cesariana, Aborto, Intercorrências Clínicas), com os mesmos códigos do indicador de motivos (0409060313 incluído em parto vaginal). DIAS_PERM = </w:t>
-            </w:r>
-            <w:r>
-              <w:rPr>
-                <w:sz w:val="20"/>
-                <w:szCs w:val="20"/>
-              </w:rPr>
-              <w:lastRenderedPageBreak/>
-              <w:t>DT_SAIDA − DT_INTER (internação e alta no mesmo dia = 0).</w:t>
+              <w:t>TMP = soma de DIAS_PERM / número de AIH, no geral e por grupo (Parto Vaginal, Cesariana, Aborto, Intercorrências Clínicas), com os mesmos códigos do indicador de motivos (0409060313 incluído em parto vaginal). DIAS_PERM = DT_SAIDA − DT_INTER (internação e alta no mesmo dia = 0).</w:t>
             </w:r>
           </w:p>
           <w:p>
@@ -13623,6 +13784,7 @@
           <w:sz w:val="20"/>
           <w:szCs w:val="20"/>
         </w:rPr>
+        <w:lastRenderedPageBreak/>
         <w:t>Tabela 14 – Internações neonatais: indicadores e regras</w:t>
       </w:r>
     </w:p>
@@ -13918,15 +14080,7 @@
                 <w:sz w:val="20"/>
                 <w:szCs w:val="20"/>
               </w:rPr>
-              <w:t xml:space="preserve">Numerador: NEO = 1 com MARCA_UTI 81 ou 82 (UTI neonatal tipos II e III; Portaria GM/MS </w:t>
-            </w:r>
-            <w:r>
-              <w:rPr>
-                <w:sz w:val="20"/>
-                <w:szCs w:val="20"/>
-              </w:rPr>
-              <w:lastRenderedPageBreak/>
-              <w:t>930/2012, art. 12, parágrafo único, e Portaria GM/MS 2.862/2023, art. 146). Denominador: NEO = 1.</w:t>
+              <w:t>Numerador: NEO = 1 com MARCA_UTI 81 ou 82 (UTI neonatal tipos II e III; Portaria GM/MS 930/2012, art. 12, parágrafo único, e Portaria GM/MS 2.862/2023, art. 146). Denominador: NEO = 1.</w:t>
             </w:r>
           </w:p>
           <w:p>
@@ -13967,7 +14121,6 @@
                 <w:sz w:val="20"/>
                 <w:szCs w:val="20"/>
               </w:rPr>
-              <w:lastRenderedPageBreak/>
               <w:t>Distribuição percentual das internações neonatais por tipo de saída (alta, transferência e óbito)</w:t>
             </w:r>
           </w:p>
@@ -14230,7 +14383,15 @@
                 <w:sz w:val="20"/>
                 <w:szCs w:val="20"/>
               </w:rPr>
-              <w:t>Denominador: leitos-dia de UTIN — leitos EXISTENTES (QT_EXIST, CODLEITO 81 e 82) por competência × dias do mês —, normalizado para ano de 365 dias. Regra transitória aprovada pela coordenação (05/09/2026): o CODLEITO 80 (UTI neonatal tipo I) entra apenas nas competências em que a unidade não tem nenhum leito 81/82 (coerente com a Portaria SAES/MS 2.902/2025, que reclassificou os leitos tipo I).</w:t>
+              <w:t xml:space="preserve">Denominador: leitos-dia de UTIN — leitos EXISTENTES (QT_EXIST, CODLEITO 81 e 82) por competência × dias do mês —, normalizado para ano de 365 dias. Regra transitória aprovada pela coordenação (05/09/2026): o CODLEITO 80 (UTI neonatal tipo I) entra apenas nas competências em que a unidade não tem nenhum leito 81/82 </w:t>
+            </w:r>
+            <w:r>
+              <w:rPr>
+                <w:sz w:val="20"/>
+                <w:szCs w:val="20"/>
+              </w:rPr>
+              <w:lastRenderedPageBreak/>
+              <w:t>(coerente com a Portaria SAES/MS 2.902/2025, que reclassificou os leitos tipo I).</w:t>
             </w:r>
           </w:p>
         </w:tc>
@@ -14420,119 +14581,110 @@
                 <w:sz w:val="20"/>
                 <w:szCs w:val="20"/>
               </w:rPr>
-              <w:t xml:space="preserve">Proporção de internações obstétricas com pelo menos uma condição potencialmente ameaçadora à vida (CPAV), operacionalizada no SIH/SUS conforme o Painel de Vigilância </w:t>
-            </w:r>
+              <w:t>Proporção de internações obstétricas com pelo menos uma condição potencialmente ameaçadora à vida (CPAV), operacionalizada no SIH/SUS conforme o Painel de Vigilância da Saúde Materna do Observatório Obstétrico Brasileiro (OOBr; Domingues et al. 2024). Não corresponde a near miss materno.</w:t>
+            </w:r>
+          </w:p>
+        </w:tc>
+        <w:tc>
+          <w:tcPr>
+            <w:tcW w:w="4338" w:type="dxa"/>
+            <w:shd w:val="clear" w:color="auto" w:fill="FFFFFF"/>
+            <w:tcMar>
+              <w:top w:w="60" w:type="dxa"/>
+              <w:left w:w="90" w:type="dxa"/>
+              <w:bottom w:w="60" w:type="dxa"/>
+              <w:right w:w="90" w:type="dxa"/>
+            </w:tcMar>
+          </w:tcPr>
+          <w:p>
+            <w:pPr>
+              <w:spacing w:after="60" w:line="252" w:lineRule="auto"/>
+            </w:pPr>
+            <w:r>
+              <w:rPr>
+                <w:sz w:val="20"/>
+                <w:szCs w:val="20"/>
+              </w:rPr>
+              <w:t>Fonte: SIH-RD e SIH-SP. Critério reescrito conforme o script do OOBr (decisão da coordenação, 09/09/2026), aplicado sobre o universo obstétrico da planilha (mulheres de 10 a 59 anos). Denominador: universo obstétrico.</w:t>
+            </w:r>
+          </w:p>
+          <w:p>
+            <w:pPr>
+              <w:spacing w:after="60" w:line="252" w:lineRule="auto"/>
+            </w:pPr>
+            <w:r>
+              <w:rPr>
+                <w:sz w:val="20"/>
+                <w:szCs w:val="20"/>
+              </w:rPr>
+              <w:t>Caso = internação do universo com pelo menos um dos critérios:</w:t>
+            </w:r>
+          </w:p>
+          <w:p>
+            <w:pPr>
+              <w:spacing w:after="60" w:line="252" w:lineRule="auto"/>
+            </w:pPr>
+            <w:r>
+              <w:rPr>
+                <w:sz w:val="20"/>
+                <w:szCs w:val="20"/>
+              </w:rPr>
+              <w:t>1. CID (qualquer campo de diagnóstico): descolamento prematuro de placenta O450, O458, O459; gravidez ectópica O000 a O002, O008, O009; hemorragia pós-parto O720 a O722; rotura uterina O710, O711; pré-eclâmpsia grave O141; eclâmpsia O150 a O152, O159; hipertensão grave O11, O13, O149, O16, O100 a O104, O109, I10 a I15; encefalopatia hipertensiva I674; endometrite O85; edema pulmonar J81; insuficiência respiratória J80, J960, J969, R092, I26x, O032, O037, O042, O047, O052, O057, O062, O067, O072, O077, O082,</w:t>
+            </w:r>
+            <w:r>
+              <w:rPr>
+                <w:sz w:val="20"/>
+                <w:szCs w:val="20"/>
+              </w:rPr>
+              <w:t xml:space="preserve"> O880 a O883, O888; convulsões R568; sepse A40x, A41x, A021, A227, A267, A327, A427, B377, O080, O753, O85; choque E86, R570, R571, R578, R579, T811, I460, O083, O751; crise tireotóxica E055; transfusão Z513; histerectomia O822; intubação O29x, O74x, O89x (decisão da coordenação, 09/09/2026).</w:t>
+            </w:r>
+          </w:p>
+          <w:p>
+            <w:pPr>
+              <w:spacing w:after="60" w:line="252" w:lineRule="auto"/>
+            </w:pPr>
+            <w:r>
+              <w:rPr>
+                <w:sz w:val="20"/>
+                <w:szCs w:val="20"/>
+              </w:rPr>
+              <w:t>2. Procedimento (PROC_REA) ou ato profissional (SP_ATOPROF) correspondente aos critérios: hipertensão grave, choque, transfusão, acesso venoso central, histerectomia, diárias de UTI, cirurgias, e ainda 0411020048 (ectópica), 0409060160 (rotura), 0303100028 (eclâmpsia), 0303040211 (encefalopatia), 0303060131 (edema agudo), 0303060140 (insuficiência respiratória).</w:t>
+            </w:r>
+          </w:p>
+          <w:p>
+            <w:pPr>
+              <w:spacing w:after="60" w:line="252" w:lineRule="auto"/>
+            </w:pPr>
+            <w:r>
+              <w:rPr>
+                <w:sz w:val="20"/>
+                <w:szCs w:val="20"/>
+              </w:rPr>
+              <w:t>3. Admissão à UTI: UTI_MES_TO &gt; 0, diária de UTI (0802010083, 0802010091, 0802010105, 0802010296, 0802010318) ou ato de UTI na base SP.</w:t>
+            </w:r>
+          </w:p>
+          <w:p>
+            <w:pPr>
+              <w:spacing w:after="60" w:line="252" w:lineRule="auto"/>
+            </w:pPr>
+            <w:r>
+              <w:rPr>
+                <w:sz w:val="20"/>
+                <w:szCs w:val="20"/>
+              </w:rPr>
+              <w:t>4. Intervenção cirúrgica: procedimentos da lista do OOBr; curetagem 0411020013 apenas em episódio de parto ou com intercorrência puerperal (PROC_REA 0303100010 ou diagnóstico principal O70 a O94).</w:t>
+            </w:r>
+          </w:p>
+          <w:p>
+            <w:pPr>
+              <w:spacing w:after="60" w:line="252" w:lineRule="auto"/>
+            </w:pPr>
             <w:r>
               <w:rPr>
                 <w:sz w:val="20"/>
                 <w:szCs w:val="20"/>
               </w:rPr>
               <w:lastRenderedPageBreak/>
-              <w:t>da Saúde Materna do Observatório Obstétrico Brasileiro (OOBr; Domingues et al. 2024). Não corresponde a near miss materno.</w:t>
-            </w:r>
-          </w:p>
-        </w:tc>
-        <w:tc>
-          <w:tcPr>
-            <w:tcW w:w="4338" w:type="dxa"/>
-            <w:shd w:val="clear" w:color="auto" w:fill="FFFFFF"/>
-            <w:tcMar>
-              <w:top w:w="60" w:type="dxa"/>
-              <w:left w:w="90" w:type="dxa"/>
-              <w:bottom w:w="60" w:type="dxa"/>
-              <w:right w:w="90" w:type="dxa"/>
-            </w:tcMar>
-          </w:tcPr>
-          <w:p>
-            <w:pPr>
-              <w:spacing w:after="60" w:line="252" w:lineRule="auto"/>
-            </w:pPr>
-            <w:r>
-              <w:rPr>
-                <w:sz w:val="20"/>
-                <w:szCs w:val="20"/>
-              </w:rPr>
-              <w:lastRenderedPageBreak/>
-              <w:t>Fonte: SIH-RD e SIH-SP. Critério reescrito conforme o script do OOBr (decisão da coordenação, 09/09/2026), aplicado sobre o universo obstétrico da planilha (mulheres de 10 a 59 anos). Denominador: universo obstétrico.</w:t>
-            </w:r>
-          </w:p>
-          <w:p>
-            <w:pPr>
-              <w:spacing w:after="60" w:line="252" w:lineRule="auto"/>
-            </w:pPr>
-            <w:r>
-              <w:rPr>
-                <w:sz w:val="20"/>
-                <w:szCs w:val="20"/>
-              </w:rPr>
-              <w:lastRenderedPageBreak/>
-              <w:t>Caso = internação do universo com pelo menos um dos critérios:</w:t>
-            </w:r>
-          </w:p>
-          <w:p>
-            <w:pPr>
-              <w:spacing w:after="60" w:line="252" w:lineRule="auto"/>
-            </w:pPr>
-            <w:r>
-              <w:rPr>
-                <w:sz w:val="20"/>
-                <w:szCs w:val="20"/>
-              </w:rPr>
-              <w:t>1. CID (qualquer campo de diagnóstico): descolamento prematuro de placenta O450, O458, O459; gravidez ectópica O000 a O002, O008, O009; hemorragia pós-parto O720 a O722; rotura uterina O710, O711; pré-eclâmpsia grave O141; eclâmpsia O150 a O152, O159; hipertensão grave O11, O13, O149, O16, O100 a O104, O109, I10 a I15; encefalopatia hipertensiva I674; endometrite O85; edema pulmonar J81; insuficiência respiratória J80, J960, J969, R092, I26x, O032, O037, O042, O047, O052, O057, O062, O067, O072, O077, O082,</w:t>
-            </w:r>
-            <w:r>
-              <w:rPr>
-                <w:sz w:val="20"/>
-                <w:szCs w:val="20"/>
-              </w:rPr>
-              <w:t xml:space="preserve"> O880 a O883, O888; convulsões R568; sepse A40x, A41x, A021, A227, A267, A327, A427, B377, O080, O753, O85; choque E86, R570, R571, R578, R579, T811, I460, O083, O751; crise tireotóxica E055; transfusão Z513; histerectomia O822; intubação O29x, O74x, O89x (decisão da coordenação, 09/09/2026).</w:t>
-            </w:r>
-          </w:p>
-          <w:p>
-            <w:pPr>
-              <w:spacing w:after="60" w:line="252" w:lineRule="auto"/>
-            </w:pPr>
-            <w:r>
-              <w:rPr>
-                <w:sz w:val="20"/>
-                <w:szCs w:val="20"/>
-              </w:rPr>
-              <w:t>2. Procedimento (PROC_REA) ou ato profissional (SP_ATOPROF) correspondente aos critérios: hipertensão grave, choque, transfusão, acesso venoso central, histerectomia, diárias de UTI, cirurgias, e ainda 0411020048 (ectópica), 0409060160 (rotura), 0303100028 (eclâmpsia), 0303040211 (encefalopatia), 0303060131 (edema agudo), 0303060140 (insuficiência respiratória).</w:t>
-            </w:r>
-          </w:p>
-          <w:p>
-            <w:pPr>
-              <w:spacing w:after="60" w:line="252" w:lineRule="auto"/>
-            </w:pPr>
-            <w:r>
-              <w:rPr>
-                <w:sz w:val="20"/>
-                <w:szCs w:val="20"/>
-              </w:rPr>
-              <w:t>3. Admissão à UTI: UTI_MES_TO &gt; 0, diária de UTI (0802010083, 0802010091, 0802010105, 0802010296, 0802010318) ou ato de UTI na base SP.</w:t>
-            </w:r>
-          </w:p>
-          <w:p>
-            <w:pPr>
-              <w:spacing w:after="60" w:line="252" w:lineRule="auto"/>
-            </w:pPr>
-            <w:r>
-              <w:rPr>
-                <w:sz w:val="20"/>
-                <w:szCs w:val="20"/>
-              </w:rPr>
-              <w:t>4. Intervenção cirúrgica: procedimentos da lista do OOBr; curetagem 0411020013 apenas em episódio de parto ou com intercorrência puerperal (PROC_REA 0303100010 ou diagnóstico principal O70 a O94).</w:t>
-            </w:r>
-          </w:p>
-          <w:p>
-            <w:pPr>
-              <w:spacing w:after="60" w:line="252" w:lineRule="auto"/>
-            </w:pPr>
-            <w:r>
-              <w:rPr>
-                <w:sz w:val="20"/>
-                <w:szCs w:val="20"/>
-              </w:rPr>
               <w:t>5. Tempo de permanência maior que 7 dias (DT_SAIDA − DT_INTER) apenas em internações de parto (lista de partos do OOBr, incluído o 0409060313), excluindo AIH com diária de acompanhante 0802010024.</w:t>
             </w:r>
           </w:p>
@@ -14659,7 +14811,6 @@
                 <w:sz w:val="20"/>
                 <w:szCs w:val="20"/>
               </w:rPr>
-              <w:lastRenderedPageBreak/>
               <w:t>Complicações tromboembólicas: O880 a O883, O888; I26.</w:t>
             </w:r>
           </w:p>
@@ -14749,7 +14900,6 @@
                 <w:sz w:val="20"/>
                 <w:szCs w:val="20"/>
               </w:rPr>
-              <w:lastRenderedPageBreak/>
               <w:t>Porcentagem de casos de morbidade materna grave com internação em UTI</w:t>
             </w:r>
           </w:p>
@@ -15029,6 +15179,7 @@
                 <w:sz w:val="20"/>
                 <w:szCs w:val="20"/>
               </w:rPr>
+              <w:lastRenderedPageBreak/>
               <w:t>Porcentagem de casos de morbidade materna grave com realização de histerectomia</w:t>
             </w:r>
           </w:p>
@@ -15133,7 +15284,6 @@
           <w:sz w:val="20"/>
           <w:szCs w:val="20"/>
         </w:rPr>
-        <w:lastRenderedPageBreak/>
         <w:t>Tabela 16 – Morbidade neonatal: indicadores e regras</w:t>
       </w:r>
     </w:p>
@@ -15468,7 +15618,7 @@
       <w:pPr>
         <w:pStyle w:val="Ttulo2"/>
       </w:pPr>
-      <w:bookmarkStart w:id="17" w:name="_Toc243245233"/>
+      <w:bookmarkStart w:id="17" w:name="_Toc243245590"/>
       <w:r>
         <w:t>5.1 Comparador e destaques</w:t>
       </w:r>
@@ -15479,14 +15629,18 @@
         <w:spacing w:after="120" w:line="276" w:lineRule="auto"/>
       </w:pPr>
       <w:r>
-        <w:t>No comparador do Painel de Internação, a média do grupo é a média simples das unidades do grupo com dados no ano, e o destaque segue a regra descrita na seção 3.2. Os valores publicados referem-se às 114 unidades calculadas em 9 de setembro de 2026 e às unidades incluídas posteriormente (Pernambuco, em 12 de setembro; Maranhão, Ceará e São Paulo, em 23 de setembro de 2026).</w:t>
+        <w:t xml:space="preserve">No comparador do Painel de Internação, a média do grupo é a média simples das unidades do grupo com dados no ano, e o destaque segue a regra descrita na seção 3.2. Os valores publicados </w:t>
+      </w:r>
+      <w:r>
+        <w:lastRenderedPageBreak/>
+        <w:t>referem-se às 114 unidades calculadas em 9 de setembro de 2026 e às unidades incluídas posteriormente (Pernambuco, em 12 de setembro; Maranhão, Ceará e São Paulo, em 23 de setembro de 2026).</w:t>
       </w:r>
     </w:p>
     <w:p>
       <w:pPr>
         <w:pStyle w:val="Ttulo1"/>
       </w:pPr>
-      <w:bookmarkStart w:id="18" w:name="_Toc243245234"/>
+      <w:bookmarkStart w:id="18" w:name="_Toc243245591"/>
       <w:r>
         <w:t>6. Dicionário do Painel de Mortalidade (SIM)</w:t>
       </w:r>
@@ -15497,11 +15651,10 @@
         <w:spacing w:after="120" w:line="276" w:lineRule="auto"/>
       </w:pPr>
       <w:r>
-        <w:t xml:space="preserve">As regras desta seção são as do Dicionário de indicadores de mortalidade do grupo de maternidades, versão de 11/09/2026. O dicionário descreve os indicadores publicados no painel e nas apresentações por maternidade, calculados em 11 de setembro de 2026 segundo as seguintes regras: óbito materno pela definição do Ministério da Saúde; Lista Brasileira de Causas de Mortes Evitáveis por Intervenções do SUS (LBE), na versão de tabulação para menores de 5 anos do </w:t>
+        <w:t>As regras desta seção são as do Dicionário de indicadores de mortalidade do grupo de maternidades, versão de 11/09/2026. O dicionário descreve os indicadores publicados no painel e nas apresentações por maternidade, calculados em 11 de setembro de 2026 segundo as seguintes regras: óbito materno pela definição do Ministério da Saúde; Lista Brasileira de Causas de Mortes Evitáveis por Intervenções do SUS (LBE), na versão de tabulação para menores de 5 anos do DATASUS e da Secretaria de Vigilância em Saúde (SV</w:t>
       </w:r>
       <w:r>
-        <w:lastRenderedPageBreak/>
-        <w:t>DATASUS e da Secretaria de Vigilância em Saúde (SVS); e recuperação da idade neonatal pelo campo IDADE da Declaração de Óbito.</w:t>
+        <w:t>S); e recuperação da idade neonatal pelo campo IDADE da Declaração de Óbito.</w:t>
       </w:r>
     </w:p>
     <w:p>
@@ -15754,7 +15907,15 @@
                 <w:sz w:val="20"/>
                 <w:szCs w:val="20"/>
               </w:rPr>
-              <w:t>Registros com CODESTAB em branco (óbitos em domicílio, via pública ou sem identificação do estabelecimento) não são atribuídos a nenhuma unidade. HCFAMEMA (Marília, SP): os CNES 2025507 (hospital adulto) e 2025523 (materno-infantil) são tratados como um único complexo: óbitos dos dois códigos e nascidos vivos do 2025523.</w:t>
+              <w:t xml:space="preserve">Registros com CODESTAB em branco (óbitos em domicílio, via pública ou sem identificação do estabelecimento) não são atribuídos a nenhuma unidade. HCFAMEMA (Marília, SP): os CNES 2025507 (hospital adulto) e 2025523 (materno-infantil) são tratados como um único complexo: </w:t>
+            </w:r>
+            <w:r>
+              <w:rPr>
+                <w:sz w:val="20"/>
+                <w:szCs w:val="20"/>
+              </w:rPr>
+              <w:lastRenderedPageBreak/>
+              <w:t>óbitos dos dois códigos e nascidos vivos do 2025523.</w:t>
             </w:r>
           </w:p>
         </w:tc>
@@ -15783,6 +15944,7 @@
                 <w:sz w:val="20"/>
                 <w:szCs w:val="20"/>
               </w:rPr>
+              <w:lastRenderedPageBreak/>
               <w:t>Nascidos vivos (denominador)</w:t>
             </w:r>
           </w:p>
@@ -15884,7 +16046,6 @@
                 <w:sz w:val="20"/>
                 <w:szCs w:val="20"/>
               </w:rPr>
-              <w:lastRenderedPageBreak/>
               <w:t>Situação dos dados</w:t>
             </w:r>
           </w:p>
@@ -16231,7 +16392,15 @@
                 <w:sz w:val="20"/>
                 <w:szCs w:val="20"/>
               </w:rPr>
-              <w:t>Não há filtro de idade. Registros com OBITOGRAV e OBITOPUERP ignorados entram apenas pelas condições (a) e (b). Homens e óbitos com causa presumível sem confirmação do momento (condição c com campos ignorados) não entram: essa era a diferença da regra anterior, que contava todos os B20 a B24 com os campos em branco.</w:t>
+              <w:t xml:space="preserve">Não há filtro de idade. Registros com OBITOGRAV e OBITOPUERP ignorados entram apenas pelas </w:t>
+            </w:r>
+            <w:r>
+              <w:rPr>
+                <w:sz w:val="20"/>
+                <w:szCs w:val="20"/>
+              </w:rPr>
+              <w:lastRenderedPageBreak/>
+              <w:t>condições (a) e (b). Homens e óbitos com causa presumível sem confirmação do momento (condição c com campos ignorados) não entram: essa era a diferença da regra anterior, que contava todos os B20 a B24 com os campos em branco.</w:t>
             </w:r>
           </w:p>
           <w:p>
@@ -16272,6 +16441,7 @@
                 <w:sz w:val="20"/>
                 <w:szCs w:val="20"/>
               </w:rPr>
+              <w:lastRenderedPageBreak/>
               <w:t>Razão de Mortalidade Materna (RMM)</w:t>
             </w:r>
           </w:p>
@@ -16296,15 +16466,7 @@
                 <w:sz w:val="20"/>
                 <w:szCs w:val="20"/>
               </w:rPr>
-              <w:t xml:space="preserve">Número de óbitos maternos ocorridos na unidade, dividido pelo número de nascidos vivos ocorridos na unidade no </w:t>
-            </w:r>
-            <w:r>
-              <w:rPr>
-                <w:sz w:val="20"/>
-                <w:szCs w:val="20"/>
-              </w:rPr>
-              <w:lastRenderedPageBreak/>
-              <w:t>mesmo ano e multiplicado por 100.000.</w:t>
+              <w:t>Número de óbitos maternos ocorridos na unidade, dividido pelo número de nascidos vivos ocorridos na unidade no mesmo ano e multiplicado por 100.000.</w:t>
             </w:r>
           </w:p>
         </w:tc>
@@ -16328,7 +16490,6 @@
                 <w:sz w:val="20"/>
                 <w:szCs w:val="20"/>
               </w:rPr>
-              <w:lastRenderedPageBreak/>
               <w:t>Fonte: SIM-DO e SINASC.</w:t>
             </w:r>
           </w:p>
@@ -16341,15 +16502,7 @@
                 <w:sz w:val="20"/>
                 <w:szCs w:val="20"/>
               </w:rPr>
-              <w:t xml:space="preserve">Numerador: OBITO_MATERNO = 1, por CODESTAB e ano de DTOBITO. Denominador: nascidos vivos por CODESTAB e ano de DTNASC. Sem fator de </w:t>
-            </w:r>
-            <w:r>
-              <w:rPr>
-                <w:sz w:val="20"/>
-                <w:szCs w:val="20"/>
-              </w:rPr>
-              <w:lastRenderedPageBreak/>
-              <w:t>correção (o IDB aplica fator de correção apenas aos agregados de UF e país).</w:t>
+              <w:t>Numerador: OBITO_MATERNO = 1, por CODESTAB e ano de DTOBITO. Denominador: nascidos vivos por CODESTAB e ano de DTNASC. Sem fator de correção (o IDB aplica fator de correção apenas aos agregados de UF e país).</w:t>
             </w:r>
           </w:p>
           <w:p>
@@ -16390,7 +16543,6 @@
                 <w:sz w:val="20"/>
                 <w:szCs w:val="20"/>
               </w:rPr>
-              <w:lastRenderedPageBreak/>
               <w:t>Distribuição dos óbitos maternos por tipo de causa obstétrica (diretas, indiretas e inespecíficas)</w:t>
             </w:r>
           </w:p>
@@ -16660,6 +16812,7 @@
                 <w:sz w:val="20"/>
                 <w:szCs w:val="20"/>
               </w:rPr>
+              <w:lastRenderedPageBreak/>
               <w:t>"Outras causas diretas" = demais causas diretas (O21 a O23, O24.4, O26 a O43, O47 a O66, O68 a O71, O73 a O84, O87, O89, O90, O92, A34, D39.2, E23.0, F53, M83.0).</w:t>
             </w:r>
           </w:p>
@@ -16701,6 +16854,7 @@
                 <w:sz w:val="20"/>
                 <w:szCs w:val="20"/>
               </w:rPr>
+              <w:lastRenderedPageBreak/>
               <w:t>Distribuição dos óbitos maternos indiretos por grupo de causas</w:t>
             </w:r>
           </w:p>
@@ -16725,15 +16879,7 @@
                 <w:sz w:val="20"/>
                 <w:szCs w:val="20"/>
               </w:rPr>
-              <w:t xml:space="preserve">Número de óbitos maternos por causas obstétricas indiretas </w:t>
-            </w:r>
-            <w:r>
-              <w:rPr>
-                <w:sz w:val="20"/>
-                <w:szCs w:val="20"/>
-              </w:rPr>
-              <w:lastRenderedPageBreak/>
-              <w:t>em cada grupo de causas, com o total de indiretas.</w:t>
+              <w:t>Número de óbitos maternos por causas obstétricas indiretas em cada grupo de causas, com o total de indiretas.</w:t>
             </w:r>
           </w:p>
         </w:tc>
@@ -16757,7 +16903,6 @@
                 <w:sz w:val="20"/>
                 <w:szCs w:val="20"/>
               </w:rPr>
-              <w:lastRenderedPageBreak/>
               <w:t>Fonte: SIM-DO.</w:t>
             </w:r>
           </w:p>
@@ -16770,7 +16915,6 @@
                 <w:sz w:val="20"/>
                 <w:szCs w:val="20"/>
               </w:rPr>
-              <w:lastRenderedPageBreak/>
               <w:t>Criada a variável GRUPO_INDIRETA a partir de CAUSABAS dos registros com TIPO_CAUSA = "Indireta":</w:t>
             </w:r>
           </w:p>
@@ -17093,19 +17237,7 @@
                 <w:sz w:val="20"/>
                 <w:szCs w:val="20"/>
               </w:rPr>
-              <w:t>Não entram: registros com idade gestacional inferior a 22 semanas e peso inferior a 500 g; e registros com os dois campos ignorados (branco, 99 ou 9999, ou fora da faixa válida). Este segundo grupo é uma exclusão, não uma estimativa: o IDB recomenda incluir no numerador os óbitos fetais com idade gestacional ignorada. A opção adotada é conservadora e deve constar nas notas das apresentações.</w:t>
-            </w:r>
-          </w:p>
-          <w:p>
-            <w:pPr>
-              <w:spacing w:after="60" w:line="252" w:lineRule="auto"/>
-            </w:pPr>
-            <w:r>
-              <w:rPr>
-                <w:sz w:val="20"/>
-                <w:szCs w:val="20"/>
-              </w:rPr>
-              <w:t xml:space="preserve">Estabelecimento: CODESTAB; ano: DTOBITO. Referência: IDB/DATASUS C.5; CID-10, volume 2 (limite de 22 semanas ou 500 g para as estatísticas perinatais nacionais); Portaria SVS/MS 116/2009 (a DO fetal é obrigatória a partir de 20 semanas, 500 </w:t>
+              <w:t xml:space="preserve">Não entram: registros com idade gestacional inferior a 22 semanas e peso inferior a 500 g; e registros com os dois campos ignorados (branco, 99 ou 9999, ou fora da faixa válida). Este segundo </w:t>
             </w:r>
             <w:r>
               <w:rPr>
@@ -17113,7 +17245,19 @@
                 <w:szCs w:val="20"/>
               </w:rPr>
               <w:lastRenderedPageBreak/>
-              <w:t>g ou 25 cm, por isso o arquivo contém registros abaixo do limite estatístico).</w:t>
+              <w:t>grupo é uma exclusão, não uma estimativa: o IDB recomenda incluir no numerador os óbitos fetais com idade gestacional ignorada. A opção adotada é conservadora e deve constar nas notas das apresentações.</w:t>
+            </w:r>
+          </w:p>
+          <w:p>
+            <w:pPr>
+              <w:spacing w:after="60" w:line="252" w:lineRule="auto"/>
+            </w:pPr>
+            <w:r>
+              <w:rPr>
+                <w:sz w:val="20"/>
+                <w:szCs w:val="20"/>
+              </w:rPr>
+              <w:t>Estabelecimento: CODESTAB; ano: DTOBITO. Referência: IDB/DATASUS C.5; CID-10, volume 2 (limite de 22 semanas ou 500 g para as estatísticas perinatais nacionais); Portaria SVS/MS 116/2009 (a DO fetal é obrigatória a partir de 20 semanas, 500 g ou 25 cm, por isso o arquivo contém registros abaixo do limite estatístico).</w:t>
             </w:r>
           </w:p>
         </w:tc>
@@ -17530,6 +17674,7 @@
                 <w:sz w:val="20"/>
                 <w:szCs w:val="20"/>
               </w:rPr>
+              <w:lastRenderedPageBreak/>
               <w:t>"Transtornos ligados à gestação e crescimento fetal" = P05, P07, P08;</w:t>
             </w:r>
           </w:p>
@@ -17590,7 +17735,6 @@
                 <w:sz w:val="20"/>
                 <w:szCs w:val="20"/>
               </w:rPr>
-              <w:lastRenderedPageBreak/>
               <w:t>"Causas mal definidas" = R00 a R99, P95 (morte fetal de causa não especificada);</w:t>
             </w:r>
           </w:p>
@@ -17983,6 +18127,7 @@
                 <w:sz w:val="20"/>
                 <w:szCs w:val="20"/>
               </w:rPr>
+              <w:lastRenderedPageBreak/>
               <w:t>Distribuição percentual dos óbitos perinatais por faixa de peso</w:t>
             </w:r>
           </w:p>
@@ -18072,18 +18217,7 @@
                 <w:sz w:val="20"/>
                 <w:szCs w:val="20"/>
               </w:rPr>
-              <w:t xml:space="preserve">Distribuição percentual dos óbitos perinatais por </w:t>
-            </w:r>
-            <w:r>
-              <w:rPr>
-                <w:b/>
-                <w:bCs/>
-                <w:color w:val="0A213D"/>
-                <w:sz w:val="20"/>
-                <w:szCs w:val="20"/>
-              </w:rPr>
-              <w:lastRenderedPageBreak/>
-              <w:t>momento do óbito (componente fetal e neonatal precoce)</w:t>
+              <w:t>Distribuição percentual dos óbitos perinatais por momento do óbito (componente fetal e neonatal precoce)</w:t>
             </w:r>
           </w:p>
         </w:tc>
@@ -18107,16 +18241,7 @@
                 <w:sz w:val="20"/>
                 <w:szCs w:val="20"/>
               </w:rPr>
-              <w:lastRenderedPageBreak/>
-              <w:t xml:space="preserve">Total de óbitos perinatais em cada componente (fetal ou </w:t>
-            </w:r>
-            <w:r>
-              <w:rPr>
-                <w:sz w:val="20"/>
-                <w:szCs w:val="20"/>
-              </w:rPr>
-              <w:lastRenderedPageBreak/>
-              <w:t>neonatal precoce), dividido pelo total de óbitos perinatais e multiplicado por 100.</w:t>
+              <w:t>Total de óbitos perinatais em cada componente (fetal ou neonatal precoce), dividido pelo total de óbitos perinatais e multiplicado por 100.</w:t>
             </w:r>
           </w:p>
         </w:tc>
@@ -18140,7 +18265,6 @@
                 <w:sz w:val="20"/>
                 <w:szCs w:val="20"/>
               </w:rPr>
-              <w:lastRenderedPageBreak/>
               <w:t>Fonte: SIM-DOFET e SIM-DO.</w:t>
             </w:r>
           </w:p>
@@ -18153,7 +18277,6 @@
                 <w:sz w:val="20"/>
                 <w:szCs w:val="20"/>
               </w:rPr>
-              <w:lastRenderedPageBreak/>
               <w:t>"Fetal" = OBITO_FETAL = 1 (registro da DOFET); "Neonatal precoce" = óbito da DO com IDADE_DIAS entre 0 e 6. Denominador: OBITO_PERINATAL = 1.</w:t>
             </w:r>
           </w:p>
@@ -18183,7 +18306,6 @@
                 <w:sz w:val="20"/>
                 <w:szCs w:val="20"/>
               </w:rPr>
-              <w:lastRenderedPageBreak/>
               <w:t>Distribuição percentual dos óbitos perinatais por grupo de causas</w:t>
             </w:r>
           </w:p>
@@ -18595,6 +18717,7 @@
                 <w:sz w:val="20"/>
                 <w:szCs w:val="20"/>
               </w:rPr>
+              <w:lastRenderedPageBreak/>
               <w:t>Limitação estrutural: o óbito é atribuído pelo local de ocorrência e a DO não informa o estabelecimento de nascimento. Em maternidades de referência com UTI neonatal, óbitos de recém-nascidos nascidos em outro serviço entram no numerador enquanto o denominador só tem os nascidos vivos da própria unidade, o que eleva a taxa. A taxa por estabelecimento não é comparável à taxa populacional do IDB.</w:t>
             </w:r>
           </w:p>
@@ -19142,6 +19265,7 @@
                 <w:sz w:val="20"/>
                 <w:szCs w:val="20"/>
               </w:rPr>
+              <w:lastRenderedPageBreak/>
               <w:t>"Reduzíveis por imunoprevenção" = A17, A19, A33, A35 a A37, A80, B05, B06, B16, B26, G00.0, P35.0, P35.3;</w:t>
             </w:r>
           </w:p>
@@ -19166,7 +19290,6 @@
                 <w:sz w:val="20"/>
                 <w:szCs w:val="20"/>
               </w:rPr>
-              <w:lastRenderedPageBreak/>
               <w:t>"Reduzíveis por atenção à mulher no parto" = P02.0, P02.1, P02.4 a P02.6, P03, P08, P10 a P15, P20, P21, P24.0 a P24.2, P24.8, P24.9;</w:t>
             </w:r>
           </w:p>
@@ -19271,7 +19394,7 @@
       <w:pPr>
         <w:pStyle w:val="Ttulo2"/>
       </w:pPr>
-      <w:bookmarkStart w:id="19" w:name="_Toc243245235"/>
+      <w:bookmarkStart w:id="19" w:name="_Toc243245592"/>
       <w:r>
         <w:t>6.1 Notas metodológicas do dicionário</w:t>
       </w:r>
@@ -19287,11 +19410,8 @@
         <w:spacing w:after="80" w:line="276" w:lineRule="auto"/>
       </w:pPr>
       <w:r>
-        <w:t xml:space="preserve">Ocorrência versus nascimento. Todos os óbitos são atribuídos ao CNES do local de ocorrência (CODESTAB da DO ou da DOFET). A DO não informa o estabelecimento de nascimento, e as taxas neonatais e perinatais de maternidades de referência incluem recém-nascidos transferidos de outros serviços. A razão de mortalidade materna tem a mesma limitação </w:t>
-      </w:r>
-      <w:r>
         <w:lastRenderedPageBreak/>
-        <w:t>para gestantes e puérperas transferidas. Os indicadores medem a mortalidade ocorrida na unidade, não o risco da população atendida.</w:t>
+        <w:t>Ocorrência versus nascimento. Todos os óbitos são atribuídos ao CNES do local de ocorrência (CODESTAB da DO ou da DOFET). A DO não informa o estabelecimento de nascimento, e as taxas neonatais e perinatais de maternidades de referência incluem recém-nascidos transferidos de outros serviços. A razão de mortalidade materna tem a mesma limitação para gestantes e puérperas transferidas. Os indicadores medem a mortalidade ocorrida na unidade, não o risco da população atendida.</w:t>
       </w:r>
     </w:p>
     <w:p>
@@ -19337,7 +19457,7 @@
       <w:pPr>
         <w:pStyle w:val="Ttulo2"/>
       </w:pPr>
-      <w:bookmarkStart w:id="20" w:name="_Toc243245236"/>
+      <w:bookmarkStart w:id="20" w:name="_Toc243245593"/>
       <w:r>
         <w:t>6.2 Indicadores dos mapas e do comparador</w:t>
       </w:r>
@@ -19348,7 +19468,7 @@
         <w:spacing w:after="120" w:line="276" w:lineRule="auto"/>
       </w:pPr>
       <w:r>
-        <w:t>O Painel de Mortalidade tem 38 indicadores de mapa e comparador, em cinco blocos (visão geral, materna, fetal, perinatal e neonatal), derivados das tabelas do dicionário, mas com denominadores próprios. As fichas abaixo são as da página "Metodologia" do painel. Nas tabelas do dossiê, os percentuais de peso e de momento do óbito incluem a categoria "Ignorado" (o total soma 100%); nos mapas e no comparador, os ignorados ficam fora do denominador.</w:t>
+        <w:t>O Painel de Mortalidade tem 38 indicadores de mapa e comparador, em cinco blocos (visão geral, materna, fetal, perinatal e neonatal), derivados das tabelas do dicionário, mas com denominadores próprios. As fichas abaixo são as da página "Metodologia" do painel. Nas tabelas do perfil da unidade, os percentuais de peso e de momento do óbito incluem a categoria "Ignorado" (o total soma 100%); nos mapas e no comparador, os ignorados ficam fora do denominador.</w:t>
       </w:r>
     </w:p>
     <w:p>
@@ -19725,7 +19845,15 @@
                 <w:sz w:val="20"/>
                 <w:szCs w:val="20"/>
               </w:rPr>
-              <w:t>Óbitos maternos ocorridos na unidade por 100 mil nascidos vivos ocorridos na unidade (definição do Ministério da Saúde para óbito materno).</w:t>
+              <w:t xml:space="preserve">Óbitos maternos ocorridos na unidade por 100 mil nascidos vivos ocorridos na unidade (definição do </w:t>
+            </w:r>
+            <w:r>
+              <w:rPr>
+                <w:sz w:val="20"/>
+                <w:szCs w:val="20"/>
+              </w:rPr>
+              <w:lastRenderedPageBreak/>
+              <w:t>Ministério da Saúde para óbito materno).</w:t>
             </w:r>
           </w:p>
         </w:tc>
@@ -19749,6 +19877,7 @@
                 <w:sz w:val="20"/>
                 <w:szCs w:val="20"/>
               </w:rPr>
+              <w:lastRenderedPageBreak/>
               <w:t>Óbitos maternos ocorridos na unidade no ano (regra acima).</w:t>
             </w:r>
           </w:p>
@@ -19809,7 +19938,7 @@
                 <w:sz w:val="20"/>
                 <w:szCs w:val="20"/>
               </w:rPr>
-              <w:t xml:space="preserve">Razão por estabelecimento de ocorrência: o numerador inclui mulheres cujo parto ocorreu em outro serviço ou transferidas; em unidades com poucos nascidos vivos, um único óbito </w:t>
+              <w:t xml:space="preserve">Razão por estabelecimento de ocorrência: o numerador inclui mulheres cujo parto </w:t>
             </w:r>
             <w:r>
               <w:rPr>
@@ -19817,7 +19946,7 @@
                 <w:szCs w:val="20"/>
               </w:rPr>
               <w:lastRenderedPageBreak/>
-              <w:t>produz valores altos — leia junto com o número absoluto.</w:t>
+              <w:t>ocorreu em outro serviço ou transferidas; em unidades com poucos nascidos vivos, um único óbito produz valores altos — leia junto com o número absoluto.</w:t>
             </w:r>
           </w:p>
           <w:p>
@@ -20265,6 +20394,7 @@
                 <w:sz w:val="20"/>
                 <w:szCs w:val="20"/>
               </w:rPr>
+              <w:lastRenderedPageBreak/>
               <w:t>Quanto menor, melhor.</w:t>
             </w:r>
           </w:p>
@@ -20297,7 +20427,6 @@
           <w:sz w:val="20"/>
           <w:szCs w:val="20"/>
         </w:rPr>
-        <w:lastRenderedPageBreak/>
         <w:t>Tabela 23 – Indicadores do bloco "Mortalidade materna" (mapas e comparador)</w:t>
       </w:r>
     </w:p>
@@ -20925,6 +21054,7 @@
                 <w:sz w:val="20"/>
                 <w:szCs w:val="20"/>
               </w:rPr>
+              <w:lastRenderedPageBreak/>
               <w:t>% de óbitos maternos por causas obstétricas indiretas</w:t>
             </w:r>
           </w:p>
@@ -21062,7 +21192,6 @@
                 <w:sz w:val="20"/>
                 <w:szCs w:val="20"/>
               </w:rPr>
-              <w:lastRenderedPageBreak/>
               <w:t>% dos óbitos maternos diretos por hipertensão</w:t>
             </w:r>
           </w:p>
@@ -21818,6 +21947,7 @@
                 <w:sz w:val="20"/>
                 <w:szCs w:val="20"/>
               </w:rPr>
+              <w:lastRenderedPageBreak/>
               <w:t>Taxa de mortalidade fetal (por mil nascimentos)</w:t>
             </w:r>
           </w:p>
@@ -21955,7 +22085,6 @@
                 <w:sz w:val="20"/>
                 <w:szCs w:val="20"/>
               </w:rPr>
-              <w:lastRenderedPageBreak/>
               <w:t>% de óbitos fetais anteparto</w:t>
             </w:r>
           </w:p>
@@ -22860,7 +22989,15 @@
                 <w:sz w:val="20"/>
                 <w:szCs w:val="20"/>
               </w:rPr>
-              <w:t>Óbitos fetais (22 semanas ou mais, ou 500 g ou mais) mais óbitos neonatais precoces (0 a 6 dias) ocorridos na unidade.</w:t>
+              <w:t xml:space="preserve">Óbitos fetais (22 semanas ou mais, ou </w:t>
+            </w:r>
+            <w:r>
+              <w:rPr>
+                <w:sz w:val="20"/>
+                <w:szCs w:val="20"/>
+              </w:rPr>
+              <w:lastRenderedPageBreak/>
+              <w:t>500 g ou mais) mais óbitos neonatais precoces (0 a 6 dias) ocorridos na unidade.</w:t>
             </w:r>
           </w:p>
         </w:tc>
@@ -22884,7 +23021,16 @@
                 <w:sz w:val="20"/>
                 <w:szCs w:val="20"/>
               </w:rPr>
-              <w:t>Óbitos fetais (≥22 semanas ou ≥500 g) + óbitos de nascidos vivos com 0 a 6 dias de vida (SIM-DO) ocorridos na unidade.</w:t>
+              <w:lastRenderedPageBreak/>
+              <w:t xml:space="preserve">Óbitos fetais (≥22 semanas ou ≥500 g) + </w:t>
+            </w:r>
+            <w:r>
+              <w:rPr>
+                <w:sz w:val="20"/>
+                <w:szCs w:val="20"/>
+              </w:rPr>
+              <w:lastRenderedPageBreak/>
+              <w:t>óbitos de nascidos vivos com 0 a 6 dias de vida (SIM-DO) ocorridos na unidade.</w:t>
             </w:r>
           </w:p>
         </w:tc>
@@ -22908,6 +23054,7 @@
                 <w:sz w:val="20"/>
                 <w:szCs w:val="20"/>
               </w:rPr>
+              <w:lastRenderedPageBreak/>
               <w:t>Não se aplica: é um número absoluto.</w:t>
             </w:r>
           </w:p>
@@ -22944,6 +23091,7 @@
                 <w:sz w:val="20"/>
                 <w:szCs w:val="20"/>
               </w:rPr>
+              <w:lastRenderedPageBreak/>
               <w:t>Quanto menor, melhor.</w:t>
             </w:r>
           </w:p>
@@ -22973,18 +23121,8 @@
                 <w:sz w:val="20"/>
                 <w:szCs w:val="20"/>
               </w:rPr>
-              <w:t xml:space="preserve">Taxa de mortalidade </w:t>
-            </w:r>
-            <w:r>
-              <w:rPr>
-                <w:b/>
-                <w:bCs/>
-                <w:color w:val="0A213D"/>
-                <w:sz w:val="20"/>
-                <w:szCs w:val="20"/>
-              </w:rPr>
               <w:lastRenderedPageBreak/>
-              <w:t>perinatal (por mil nascimentos)</w:t>
+              <w:t>Taxa de mortalidade perinatal (por mil nascimentos)</w:t>
             </w:r>
           </w:p>
         </w:tc>
@@ -23008,16 +23146,7 @@
                 <w:sz w:val="20"/>
                 <w:szCs w:val="20"/>
               </w:rPr>
-              <w:lastRenderedPageBreak/>
-              <w:t xml:space="preserve">Óbitos perinatais por mil nascimentos </w:t>
-            </w:r>
-            <w:r>
-              <w:rPr>
-                <w:sz w:val="20"/>
-                <w:szCs w:val="20"/>
-              </w:rPr>
-              <w:lastRenderedPageBreak/>
-              <w:t>(nascidos vivos + óbitos fetais) ocorridos na unidade.</w:t>
+              <w:t>Óbitos perinatais por mil nascimentos (nascidos vivos + óbitos fetais) ocorridos na unidade.</w:t>
             </w:r>
           </w:p>
         </w:tc>
@@ -23041,7 +23170,6 @@
                 <w:sz w:val="20"/>
                 <w:szCs w:val="20"/>
               </w:rPr>
-              <w:lastRenderedPageBreak/>
               <w:t>Óbitos perinatais (regra acima).</w:t>
             </w:r>
           </w:p>
@@ -23066,15 +23194,7 @@
                 <w:sz w:val="20"/>
                 <w:szCs w:val="20"/>
               </w:rPr>
-              <w:t xml:space="preserve">Nascimentos ocorridos na </w:t>
-            </w:r>
-            <w:r>
-              <w:rPr>
-                <w:sz w:val="20"/>
-                <w:szCs w:val="20"/>
-              </w:rPr>
-              <w:lastRenderedPageBreak/>
-              <w:t>unidade: nascidos vivos + óbitos fetais, × 1.000 (IDB C.5).</w:t>
+              <w:t>Nascimentos ocorridos na unidade: nascidos vivos + óbitos fetais, × 1.000 (IDB C.5).</w:t>
             </w:r>
           </w:p>
         </w:tc>
@@ -23098,7 +23218,6 @@
                 <w:sz w:val="20"/>
                 <w:szCs w:val="20"/>
               </w:rPr>
-              <w:lastRenderedPageBreak/>
               <w:t>SIM-DOFET, SIM-DO e SINASC</w:t>
             </w:r>
           </w:p>
@@ -23111,7 +23230,6 @@
                 <w:sz w:val="20"/>
                 <w:szCs w:val="20"/>
               </w:rPr>
-              <w:lastRenderedPageBreak/>
               <w:t>O componente neonatal precoce é atribuído pelo local do óbito; a DO não informa o estabelecimento de nascimento. Em maternidades com UTI neonatal, recém-nascidos nascidos em outro serviço entram no numerador sem entrar no denominador.</w:t>
             </w:r>
           </w:p>
@@ -23153,7 +23271,6 @@
                 <w:sz w:val="20"/>
                 <w:szCs w:val="20"/>
               </w:rPr>
-              <w:lastRenderedPageBreak/>
               <w:t>% do componente fetal na mortalidade perinatal</w:t>
             </w:r>
           </w:p>
@@ -25888,7 +26005,7 @@
                 <w:sz w:val="20"/>
                 <w:szCs w:val="20"/>
               </w:rPr>
-              <w:t>Grupos de causas dos óbitos fetais, perinatais e neonatais (tabelas do dossiê)</w:t>
+              <w:t>Grupos de causas dos óbitos fetais, perinatais e neonatais (tabelas do perfil da unidade)</w:t>
             </w:r>
           </w:p>
         </w:tc>
@@ -25984,7 +26101,7 @@
                 <w:sz w:val="20"/>
                 <w:szCs w:val="20"/>
               </w:rPr>
-              <w:t>Ministério da Saúde - SIM (DO e DOFET), 2019 a 2025.</w:t>
+              <w:t xml:space="preserve">Ministério da Saúde - SIM (DO e DOFET), </w:t>
             </w:r>
           </w:p>
         </w:tc>
@@ -26013,7 +26130,7 @@
                 <w:sz w:val="20"/>
                 <w:szCs w:val="20"/>
               </w:rPr>
-              <w:t>Grupos de causas maternas diretas e indiretas (tabelas do dossiê)</w:t>
+              <w:t>Grupos de causas maternas diretas e indiretas (tabelas do perfil da unidade)</w:t>
             </w:r>
           </w:p>
         </w:tc>
@@ -26118,7 +26235,7 @@
                 <w:sz w:val="20"/>
                 <w:szCs w:val="20"/>
               </w:rPr>
-              <w:t>Ministério da Saúde - SIM-DO, 2019 a 2025.</w:t>
+              <w:t xml:space="preserve">Ministério da Saúde - SIM-DO, </w:t>
             </w:r>
           </w:p>
         </w:tc>
@@ -26147,7 +26264,7 @@
                 <w:sz w:val="20"/>
                 <w:szCs w:val="20"/>
               </w:rPr>
-              <w:t>Faixas de peso ao nascer (tabelas do dossiê)</w:t>
+              <w:t>Faixas de peso ao nascer (tabelas do perfil da unidade)</w:t>
             </w:r>
           </w:p>
         </w:tc>
@@ -26243,7 +26360,7 @@
                 <w:sz w:val="20"/>
                 <w:szCs w:val="20"/>
               </w:rPr>
-              <w:t>Ministério da Saúde - SIM (DO e DOFET), 2019 a 2025.</w:t>
+              <w:t xml:space="preserve">Ministério da Saúde - SIM (DO e DOFET), </w:t>
             </w:r>
           </w:p>
         </w:tc>
@@ -26368,7 +26485,7 @@
                 <w:sz w:val="20"/>
                 <w:szCs w:val="20"/>
               </w:rPr>
-              <w:t>Ministério da Saúde - SIM e SINASC, 2019 a 2025.</w:t>
+              <w:t xml:space="preserve">Ministério da Saúde - SIM e SINASC, </w:t>
             </w:r>
           </w:p>
         </w:tc>
@@ -26493,7 +26610,7 @@
                 <w:sz w:val="20"/>
                 <w:szCs w:val="20"/>
               </w:rPr>
-              <w:t>Ministério da Saúde - SIM e SINASC, 2019 a 2025.</w:t>
+              <w:t xml:space="preserve">Ministério da Saúde - SIM e SINASC, </w:t>
             </w:r>
           </w:p>
         </w:tc>
@@ -26508,7 +26625,7 @@
       <w:pPr>
         <w:pStyle w:val="Ttulo1"/>
       </w:pPr>
-      <w:bookmarkStart w:id="21" w:name="_Toc243245237"/>
+      <w:bookmarkStart w:id="21" w:name="_Toc243245594"/>
       <w:r>
         <w:t>7. Notas comuns aos três painéis</w:t>
       </w:r>
@@ -26518,7 +26635,7 @@
       <w:pPr>
         <w:pStyle w:val="Ttulo2"/>
       </w:pPr>
-      <w:bookmarkStart w:id="22" w:name="_Toc243245238"/>
+      <w:bookmarkStart w:id="22" w:name="_Toc243245595"/>
       <w:r>
         <w:t>7.1 Notas gerais</w:t>
       </w:r>
@@ -26591,10 +26708,10 @@
         <w:t xml:space="preserve">Ocorrência e residência. </w:t>
       </w:r>
       <w:r>
-        <w:t>Nascimentos e óbitos são atribuídos ao estabelecimento onde ocorreram. A Declaração de Óbito não informa o estabelecimento de nascimento; por isso as taxas neonatais e perinatais de maternidades de referência incluem recém-nascidos transferidos de outros serviços, e a razão de mortalidade materna tem a mesma limitação para gestantes e puérperas transferidas. Os indicadores medem o que ocorreu na unidade, não o risco da população atendida. No Painel de Nascimentos, o dossiê mostra as duas perspectivas, local</w:t>
+        <w:t>Nascimentos e óbitos são atribuídos ao estabelecimento onde ocorreram. A Declaração de Óbito não informa o estabelecimento de nascimento; por isso as taxas neonatais e perinatais de maternidades de referência incluem recém-nascidos transferidos de outros serviços, e a razão de mortalidade materna tem a mesma limitação para gestantes e puérperas transferidas. Os indicadores medem o que ocorreu na unidade, não o risco da população atendida. No Painel de Nascimentos, o perfil da unidade mostra as duas perspect</w:t>
       </w:r>
       <w:r>
-        <w:t xml:space="preserve"> de residência e local de ocorrência (seção 4.3).</w:t>
+        <w:t>ivas, local de residência e local de ocorrência (seção 4.3).</w:t>
       </w:r>
     </w:p>
     <w:p>
@@ -26722,7 +26839,7 @@
       <w:pPr>
         <w:pStyle w:val="Ttulo2"/>
       </w:pPr>
-      <w:bookmarkStart w:id="23" w:name="_Toc243245239"/>
+      <w:bookmarkStart w:id="23" w:name="_Toc243245596"/>
       <w:r>
         <w:t>7.2 Situação dos anos preliminares, por base e painel</w:t>
       </w:r>
@@ -27198,7 +27315,7 @@
       <w:pPr>
         <w:pStyle w:val="Ttulo1"/>
       </w:pPr>
-      <w:bookmarkStart w:id="24" w:name="_Toc243245240"/>
+      <w:bookmarkStart w:id="24" w:name="_Toc243245597"/>
       <w:r>
         <w:t>8. Glossário de siglas e termos</w:t>
       </w:r>
@@ -28436,7 +28553,7 @@
                 <w:sz w:val="20"/>
                 <w:szCs w:val="20"/>
               </w:rPr>
-              <w:t>Dossiê</w:t>
+              <w:t>EBSERH</w:t>
             </w:r>
           </w:p>
         </w:tc>
@@ -28460,7 +28577,7 @@
                 <w:sz w:val="20"/>
                 <w:szCs w:val="20"/>
               </w:rPr>
-              <w:t>Página de detalhe de cada maternidade no painel (seção 1.3).</w:t>
+              <w:t>Empresa Brasileira de Serviços Hospitalares; grupo dos hospitais universitários federais do painel.</w:t>
             </w:r>
           </w:p>
         </w:tc>
@@ -28489,7 +28606,7 @@
                 <w:sz w:val="20"/>
                 <w:szCs w:val="20"/>
               </w:rPr>
-              <w:t>EBSERH</w:t>
+              <w:t>FTP</w:t>
             </w:r>
           </w:p>
         </w:tc>
@@ -28513,7 +28630,7 @@
                 <w:sz w:val="20"/>
                 <w:szCs w:val="20"/>
               </w:rPr>
-              <w:t>Empresa Brasileira de Serviços Hospitalares; grupo dos hospitais universitários federais do painel.</w:t>
+              <w:t>Servidor de arquivos do DATASUS na internet (do inglês file transfer protocol).</w:t>
             </w:r>
           </w:p>
         </w:tc>
@@ -28542,7 +28659,7 @@
                 <w:sz w:val="20"/>
                 <w:szCs w:val="20"/>
               </w:rPr>
-              <w:t>FTP</w:t>
+              <w:t>Habilitações</w:t>
             </w:r>
           </w:p>
         </w:tc>
@@ -28566,7 +28683,7 @@
                 <w:sz w:val="20"/>
                 <w:szCs w:val="20"/>
               </w:rPr>
-              <w:t>Servidor de arquivos do DATASUS na internet (do inglês file transfer protocol).</w:t>
+              <w:t>Serviços que o SUS autoriza o estabelecimento a realizar, registrados no CNES.</w:t>
             </w:r>
           </w:p>
         </w:tc>
@@ -28595,7 +28712,7 @@
                 <w:sz w:val="20"/>
                 <w:szCs w:val="20"/>
               </w:rPr>
-              <w:t>Habilitações</w:t>
+              <w:t>ICD-PM</w:t>
             </w:r>
           </w:p>
         </w:tc>
@@ -28619,7 +28736,7 @@
                 <w:sz w:val="20"/>
                 <w:szCs w:val="20"/>
               </w:rPr>
-              <w:t>Serviços que o SUS autoriza o estabelecimento a realizar, registrados no CNES.</w:t>
+              <w:t>Classificação da OMS para causas de óbitos perinatais (CID-PM), citada no dicionário de mortalidade.</w:t>
             </w:r>
           </w:p>
         </w:tc>
@@ -28648,7 +28765,7 @@
                 <w:sz w:val="20"/>
                 <w:szCs w:val="20"/>
               </w:rPr>
-              <w:t>ICD-PM</w:t>
+              <w:t>IDB</w:t>
             </w:r>
           </w:p>
         </w:tc>
@@ -28672,7 +28789,7 @@
                 <w:sz w:val="20"/>
                 <w:szCs w:val="20"/>
               </w:rPr>
-              <w:t>Classificação da OMS para causas de óbitos perinatais (CID-PM), citada no dicionário de mortalidade.</w:t>
+              <w:t>Indicadores e Dados Básicos para a Saúde, da Rede Interagencial de Informações para a Saúde (RIPSA), publicados pelo DATASUS; fichas C.1.1, C.1.2, C.3 e C.5.</w:t>
             </w:r>
           </w:p>
         </w:tc>
@@ -28701,7 +28818,7 @@
                 <w:sz w:val="20"/>
                 <w:szCs w:val="20"/>
               </w:rPr>
-              <w:t>IDB</w:t>
+              <w:t>IDENT</w:t>
             </w:r>
           </w:p>
         </w:tc>
@@ -28725,7 +28842,7 @@
                 <w:sz w:val="20"/>
                 <w:szCs w:val="20"/>
               </w:rPr>
-              <w:t>Indicadores e Dados Básicos para a Saúde, da Rede Interagencial de Informações para a Saúde (RIPSA), publicados pelo DATASUS; fichas C.1.1, C.1.2, C.3 e C.5.</w:t>
+              <w:t>Campo da AIH que identifica o tipo de AIH (5 = longa permanência).</w:t>
             </w:r>
           </w:p>
         </w:tc>
@@ -28754,7 +28871,7 @@
                 <w:sz w:val="20"/>
                 <w:szCs w:val="20"/>
               </w:rPr>
-              <w:t>IDENT</w:t>
+              <w:t>Ignorado</w:t>
             </w:r>
           </w:p>
         </w:tc>
@@ -28778,7 +28895,7 @@
                 <w:sz w:val="20"/>
                 <w:szCs w:val="20"/>
               </w:rPr>
-              <w:t>Campo da AIH que identifica o tipo de AIH (5 = longa permanência).</w:t>
+              <w:t>Registro com o campo em branco ou com código de "ignorado" (9, 99, 9999); fica fora do numerador e do denominador, salvo indicação em contrário.</w:t>
             </w:r>
           </w:p>
         </w:tc>
@@ -28807,7 +28924,7 @@
                 <w:sz w:val="20"/>
                 <w:szCs w:val="20"/>
               </w:rPr>
-              <w:t>Ignorado</w:t>
+              <w:t>LBE</w:t>
             </w:r>
           </w:p>
         </w:tc>
@@ -28831,7 +28948,7 @@
                 <w:sz w:val="20"/>
                 <w:szCs w:val="20"/>
               </w:rPr>
-              <w:t>Registro com o campo em branco ou com código de "ignorado" (9, 99, 9999); fica fora do numerador e do denominador, salvo indicação em contrário.</w:t>
+              <w:t>Lista Brasileira de Causas de Mortes Evitáveis por Intervenções do SUS, na versão de tabulação para menores de 5 anos do DATASUS/SVS.</w:t>
             </w:r>
           </w:p>
         </w:tc>
@@ -28860,7 +28977,7 @@
                 <w:sz w:val="20"/>
                 <w:szCs w:val="20"/>
               </w:rPr>
-              <w:t>LBE</w:t>
+              <w:t>LT</w:t>
             </w:r>
           </w:p>
         </w:tc>
@@ -28884,7 +29001,7 @@
                 <w:sz w:val="20"/>
                 <w:szCs w:val="20"/>
               </w:rPr>
-              <w:t>Lista Brasileira de Causas de Mortes Evitáveis por Intervenções do SUS, na versão de tabulação para menores de 5 anos do DATASUS/SVS.</w:t>
+              <w:t>Arquivos de leitos do CNES, por estabelecimento e mês.</w:t>
             </w:r>
           </w:p>
         </w:tc>
@@ -28913,7 +29030,7 @@
                 <w:sz w:val="20"/>
                 <w:szCs w:val="20"/>
               </w:rPr>
-              <w:t>LT</w:t>
+              <w:t>MARCA_UTI</w:t>
             </w:r>
           </w:p>
         </w:tc>
@@ -28937,7 +29054,7 @@
                 <w:sz w:val="20"/>
                 <w:szCs w:val="20"/>
               </w:rPr>
-              <w:t>Arquivos de leitos do CNES, por estabelecimento e mês.</w:t>
+              <w:t>Campo da AIH com o tipo de UTI usado (81 e 82 = UTI neonatal tipos II e III).</w:t>
             </w:r>
           </w:p>
         </w:tc>
@@ -28966,7 +29083,7 @@
                 <w:sz w:val="20"/>
                 <w:szCs w:val="20"/>
               </w:rPr>
-              <w:t>MARCA_UTI</w:t>
+              <w:t>Microdados</w:t>
             </w:r>
           </w:p>
         </w:tc>
@@ -28990,7 +29107,7 @@
                 <w:sz w:val="20"/>
                 <w:szCs w:val="20"/>
               </w:rPr>
-              <w:t>Campo da AIH com o tipo de UTI usado (81 e 82 = UTI neonatal tipos II e III).</w:t>
+              <w:t>Registros individuais de uma base (um por nascimento, internação ou óbito), publicados sem identificação pessoal.</w:t>
             </w:r>
           </w:p>
         </w:tc>
@@ -29019,7 +29136,7 @@
                 <w:sz w:val="20"/>
                 <w:szCs w:val="20"/>
               </w:rPr>
-              <w:t>Microdados</w:t>
+              <w:t>MMG</w:t>
             </w:r>
           </w:p>
         </w:tc>
@@ -29043,7 +29160,7 @@
                 <w:sz w:val="20"/>
                 <w:szCs w:val="20"/>
               </w:rPr>
-              <w:t>Registros individuais de uma base (um por nascimento, internação ou óbito), publicados sem identificação pessoal.</w:t>
+              <w:t>Morbidade materna grave.</w:t>
             </w:r>
           </w:p>
         </w:tc>
@@ -29072,7 +29189,7 @@
                 <w:sz w:val="20"/>
                 <w:szCs w:val="20"/>
               </w:rPr>
-              <w:t>MMG</w:t>
+              <w:t>MS</w:t>
             </w:r>
           </w:p>
         </w:tc>
@@ -29096,7 +29213,7 @@
                 <w:sz w:val="20"/>
                 <w:szCs w:val="20"/>
               </w:rPr>
-              <w:t>Morbidade materna grave.</w:t>
+              <w:t>Ministério da Saúde.</w:t>
             </w:r>
           </w:p>
         </w:tc>
@@ -29126,7 +29243,7 @@
                 <w:szCs w:val="20"/>
               </w:rPr>
               <w:lastRenderedPageBreak/>
-              <w:t>MS</w:t>
+              <w:t>NV</w:t>
             </w:r>
           </w:p>
         </w:tc>
@@ -29150,7 +29267,7 @@
                 <w:sz w:val="20"/>
                 <w:szCs w:val="20"/>
               </w:rPr>
-              <w:t>Ministério da Saúde.</w:t>
+              <w:t>Nascidos vivos.</w:t>
             </w:r>
           </w:p>
         </w:tc>
@@ -29179,7 +29296,7 @@
                 <w:sz w:val="20"/>
                 <w:szCs w:val="20"/>
               </w:rPr>
-              <w:t>NV</w:t>
+              <w:t>OMS</w:t>
             </w:r>
           </w:p>
         </w:tc>
@@ -29203,7 +29320,7 @@
                 <w:sz w:val="20"/>
                 <w:szCs w:val="20"/>
               </w:rPr>
-              <w:t>Nascidos vivos.</w:t>
+              <w:t>Organização Mundial da Saúde.</w:t>
             </w:r>
           </w:p>
         </w:tc>
@@ -29232,7 +29349,7 @@
                 <w:sz w:val="20"/>
                 <w:szCs w:val="20"/>
               </w:rPr>
-              <w:t>OMS</w:t>
+              <w:t>OOBr</w:t>
             </w:r>
           </w:p>
         </w:tc>
@@ -29256,7 +29373,7 @@
                 <w:sz w:val="20"/>
                 <w:szCs w:val="20"/>
               </w:rPr>
-              <w:t>Organização Mundial da Saúde.</w:t>
+              <w:t>Observatório Obstétrico Brasileiro.</w:t>
             </w:r>
           </w:p>
         </w:tc>
@@ -29285,7 +29402,7 @@
                 <w:sz w:val="20"/>
                 <w:szCs w:val="20"/>
               </w:rPr>
-              <w:t>OOBr</w:t>
+              <w:t>OpenDataSUS</w:t>
             </w:r>
           </w:p>
         </w:tc>
@@ -29309,7 +29426,7 @@
                 <w:sz w:val="20"/>
                 <w:szCs w:val="20"/>
               </w:rPr>
-              <w:t>Observatório Obstétrico Brasileiro.</w:t>
+              <w:t>Portal de dados abertos do Ministério da Saúde.</w:t>
             </w:r>
           </w:p>
         </w:tc>
@@ -29338,7 +29455,7 @@
                 <w:sz w:val="20"/>
                 <w:szCs w:val="20"/>
               </w:rPr>
-              <w:t>OpenDataSUS</w:t>
+              <w:t>OPM</w:t>
             </w:r>
           </w:p>
         </w:tc>
@@ -29362,7 +29479,7 @@
                 <w:sz w:val="20"/>
                 <w:szCs w:val="20"/>
               </w:rPr>
-              <w:t>Portal de dados abertos do Ministério da Saúde.</w:t>
+              <w:t>Órteses, próteses e materiais especiais (na SIGTAP).</w:t>
             </w:r>
           </w:p>
         </w:tc>
@@ -29391,7 +29508,7 @@
                 <w:sz w:val="20"/>
                 <w:szCs w:val="20"/>
               </w:rPr>
-              <w:t>OPM</w:t>
+              <w:t>Perfil da unidade</w:t>
             </w:r>
           </w:p>
         </w:tc>
@@ -29415,7 +29532,7 @@
                 <w:sz w:val="20"/>
                 <w:szCs w:val="20"/>
               </w:rPr>
-              <w:t>Órteses, próteses e materiais especiais (na SIGTAP).</w:t>
+              <w:t>Página de detalhe de cada maternidade no painel (seção 1.3).</w:t>
             </w:r>
           </w:p>
         </w:tc>
@@ -30596,7 +30713,7 @@
       <w:pPr>
         <w:pStyle w:val="Ttulo1"/>
       </w:pPr>
-      <w:bookmarkStart w:id="25" w:name="_Toc243245241"/>
+      <w:bookmarkStart w:id="25" w:name="_Toc243245598"/>
       <w:r>
         <w:lastRenderedPageBreak/>
         <w:t>9. Referências</w:t>
@@ -30615,7 +30732,7 @@
       <w:pPr>
         <w:pStyle w:val="Ttulo2"/>
       </w:pPr>
-      <w:bookmarkStart w:id="26" w:name="_Toc243245242"/>
+      <w:bookmarkStart w:id="26" w:name="_Toc243245599"/>
       <w:r>
         <w:t>9.1 Bases de dados e sistemas</w:t>
       </w:r>
@@ -30727,7 +30844,7 @@
       <w:pPr>
         <w:pStyle w:val="Ttulo2"/>
       </w:pPr>
-      <w:bookmarkStart w:id="27" w:name="_Toc243245243"/>
+      <w:bookmarkStart w:id="27" w:name="_Toc243245600"/>
       <w:r>
         <w:t>9.2 Normas</w:t>
       </w:r>
@@ -30815,7 +30932,7 @@
       <w:pPr>
         <w:pStyle w:val="Ttulo2"/>
       </w:pPr>
-      <w:bookmarkStart w:id="28" w:name="_Toc243245244"/>
+      <w:bookmarkStart w:id="28" w:name="_Toc243245601"/>
       <w:r>
         <w:lastRenderedPageBreak/>
         <w:t>9.3 Documentos técnicos oficiais</w:t>
@@ -31080,7 +31197,7 @@
       <w:pPr>
         <w:pStyle w:val="Ttulo2"/>
       </w:pPr>
-      <w:bookmarkStart w:id="29" w:name="_Toc243245245"/>
+      <w:bookmarkStart w:id="29" w:name="_Toc243245602"/>
       <w:r>
         <w:t>9.4 Artigos científicos citados nos dicionários</w:t>
       </w:r>
@@ -31156,7 +31273,7 @@
       <w:pPr>
         <w:pStyle w:val="Ttulo2"/>
       </w:pPr>
-      <w:bookmarkStart w:id="30" w:name="_Toc243245246"/>
+      <w:bookmarkStart w:id="30" w:name="_Toc243245603"/>
       <w:r>
         <w:t>9.5 Documentos do projeto</w:t>
       </w:r>
@@ -31442,96 +31559,10 @@
 <file path=word/numbering.xml><?xml version="1.0" encoding="utf-8"?>
 <w:numbering xmlns:wpc="http://schemas.microsoft.com/office/word/2010/wordprocessingCanvas" xmlns:cx="http://schemas.microsoft.com/office/drawing/2014/chartex" xmlns:cx1="http://schemas.microsoft.com/office/drawing/2015/9/8/chartex" xmlns:cx2="http://schemas.microsoft.com/office/drawing/2015/10/21/chartex" xmlns:cx3="http://schemas.microsoft.com/office/drawing/2016/5/9/chartex" xmlns:cx4="http://schemas.microsoft.com/office/drawing/2016/5/10/chartex" xmlns:cx5="http://schemas.microsoft.com/office/drawing/2016/5/11/chartex" xmlns:cx6="http://schemas.microsoft.com/office/drawing/2016/5/12/chartex" xmlns:cx7="http://schemas.microsoft.com/office/drawing/2016/5/13/chartex" xmlns:cx8="http://schemas.microsoft.com/office/drawing/2016/5/14/chartex" xmlns:mc="http://schemas.openxmlformats.org/markup-compatibility/2006" xmlns:aink="http://schemas.microsoft.com/office/drawing/2016/ink" xmlns:am3d="http://schemas.microsoft.com/office/drawing/2017/model3d" xmlns:o="urn:schemas-microsoft-com:office:office" xmlns:oel="http://schemas.microsoft.com/office/2019/extlst" xmlns:r="http://schemas.openxmlformats.org/officeDocument/2006/relationships" xmlns:m="http://schemas.openxmlformats.org/officeDocument/2006/math" xmlns:v="urn:schemas-microsoft-com:vml" xmlns:wp14="http://schemas.microsoft.com/office/word/2010/wordprocessingDrawing" xmlns:wp="http://schemas.openxmlformats.org/drawingml/2006/wordprocessingDrawing" xmlns:w10="urn:schemas-microsoft-com:office:word" xmlns:w="http://schemas.openxmlformats.org/wordprocessingml/2006/main" xmlns:w14="http://schemas.microsoft.com/office/word/2010/wordml" xmlns:w15="http://schemas.microsoft.com/office/word/2012/wordml" xmlns:w16cex="http://schemas.microsoft.com/office/word/2018/wordml/cex" xmlns:w16cid="http://schemas.microsoft.com/office/word/2016/wordml/cid" xmlns:w16="http://schemas.microsoft.com/office/word/2018/wordml" xmlns:w16du="http://schemas.microsoft.com/office/word/2023/wordml/word16du" xmlns:w16sdtdh="http://schemas.microsoft.com/office/word/2020/wordml/sdtdatahash" xmlns:w16sdtfl="http://schemas.microsoft.com/office/word/2024/wordml/sdtformatlock" xmlns:w16se="http://schemas.microsoft.com/office/word/2015/wordml/symex" xmlns:wpg="http://schemas.microsoft.com/office/word/2010/wordprocessingGroup" xmlns:wpi="http://schemas.microsoft.com/office/word/2010/wordprocessingInk" xmlns:wne="http://schemas.microsoft.com/office/word/2006/wordml" xmlns:wps="http://schemas.microsoft.com/office/word/2010/wordprocessingShape" mc:Ignorable="w14 w15 w16se w16cid w16 w16cex w16sdtdh w16sdtfl w16du wp14">
   <w:abstractNum w:abstractNumId="0" w15:restartNumberingAfterBreak="0">
-    <w:nsid w:val="01874C4E"/>
+    <w:nsid w:val="0B3E04E4"/>
     <w:multiLevelType w:val="hybridMultilevel"/>
-    <w:tmpl w:val="C7E4FAC2"/>
-    <w:lvl w:ilvl="0" w:tplc="8BB65372" w:tentative="1">
-      <w:start w:val="1"/>
-      <w:numFmt w:val="bullet"/>
-      <w:lvlText w:val="●"/>
-      <w:lvlJc w:val="left"/>
-      <w:pPr>
-        <w:ind w:left="720" w:hanging="360"/>
-      </w:pPr>
-    </w:lvl>
-    <w:lvl w:ilvl="1" w:tplc="BE7AE376" w:tentative="1">
-      <w:start w:val="1"/>
-      <w:numFmt w:val="bullet"/>
-      <w:lvlText w:val="○"/>
-      <w:lvlJc w:val="left"/>
-      <w:pPr>
-        <w:ind w:left="1440" w:hanging="360"/>
-      </w:pPr>
-    </w:lvl>
-    <w:lvl w:ilvl="2" w:tplc="BBA8C374" w:tentative="1">
-      <w:start w:val="1"/>
-      <w:numFmt w:val="bullet"/>
-      <w:lvlText w:val="■"/>
-      <w:lvlJc w:val="left"/>
-      <w:pPr>
-        <w:ind w:left="2160" w:hanging="360"/>
-      </w:pPr>
-    </w:lvl>
-    <w:lvl w:ilvl="3" w:tplc="DE527698" w:tentative="1">
-      <w:start w:val="1"/>
-      <w:numFmt w:val="bullet"/>
-      <w:lvlText w:val="●"/>
-      <w:lvlJc w:val="left"/>
-      <w:pPr>
-        <w:ind w:left="2880" w:hanging="360"/>
-      </w:pPr>
-    </w:lvl>
-    <w:lvl w:ilvl="4" w:tplc="12A20DA6" w:tentative="1">
-      <w:start w:val="1"/>
-      <w:numFmt w:val="bullet"/>
-      <w:lvlText w:val="○"/>
-      <w:lvlJc w:val="left"/>
-      <w:pPr>
-        <w:ind w:left="3600" w:hanging="360"/>
-      </w:pPr>
-    </w:lvl>
-    <w:lvl w:ilvl="5" w:tplc="DC16E30C" w:tentative="1">
-      <w:start w:val="1"/>
-      <w:numFmt w:val="bullet"/>
-      <w:lvlText w:val="■"/>
-      <w:lvlJc w:val="left"/>
-      <w:pPr>
-        <w:ind w:left="4320" w:hanging="360"/>
-      </w:pPr>
-    </w:lvl>
-    <w:lvl w:ilvl="6" w:tplc="D4DCA794" w:tentative="1">
-      <w:start w:val="1"/>
-      <w:numFmt w:val="bullet"/>
-      <w:lvlText w:val="●"/>
-      <w:lvlJc w:val="left"/>
-      <w:pPr>
-        <w:ind w:left="5040" w:hanging="360"/>
-      </w:pPr>
-    </w:lvl>
-    <w:lvl w:ilvl="7" w:tplc="85BAD11C" w:tentative="1">
-      <w:start w:val="1"/>
-      <w:numFmt w:val="bullet"/>
-      <w:lvlText w:val="●"/>
-      <w:lvlJc w:val="left"/>
-      <w:pPr>
-        <w:ind w:left="5760" w:hanging="360"/>
-      </w:pPr>
-    </w:lvl>
-    <w:lvl w:ilvl="8" w:tplc="A5E00C0E" w:tentative="1">
-      <w:start w:val="1"/>
-      <w:numFmt w:val="bullet"/>
-      <w:lvlText w:val="●"/>
-      <w:lvlJc w:val="left"/>
-      <w:pPr>
-        <w:ind w:left="6480" w:hanging="360"/>
-      </w:pPr>
-    </w:lvl>
-  </w:abstractNum>
-  <w:abstractNum w:abstractNumId="1" w15:restartNumberingAfterBreak="0">
-    <w:nsid w:val="13C80F3E"/>
-    <w:multiLevelType w:val="hybridMultilevel"/>
-    <w:tmpl w:val="D4F20448"/>
-    <w:lvl w:ilvl="0" w:tplc="84226CA8">
+    <w:tmpl w:val="94060E86"/>
+    <w:lvl w:ilvl="0" w:tplc="710AF8E0">
       <w:start w:val="1"/>
       <w:numFmt w:val="bullet"/>
       <w:lvlText w:val="•"/>
@@ -31543,52 +31574,52 @@
         <w:color w:val="1E6E49"/>
       </w:rPr>
     </w:lvl>
-    <w:lvl w:ilvl="1" w:tplc="04162482">
+    <w:lvl w:ilvl="1" w:tplc="46F0C2A2">
       <w:numFmt w:val="decimal"/>
       <w:lvlText w:val=""/>
       <w:lvlJc w:val="left"/>
     </w:lvl>
-    <w:lvl w:ilvl="2" w:tplc="EC3C6102">
+    <w:lvl w:ilvl="2" w:tplc="39DAE2A8">
       <w:numFmt w:val="decimal"/>
       <w:lvlText w:val=""/>
       <w:lvlJc w:val="left"/>
     </w:lvl>
-    <w:lvl w:ilvl="3" w:tplc="F5A44C82">
+    <w:lvl w:ilvl="3" w:tplc="08EC95EA">
       <w:numFmt w:val="decimal"/>
       <w:lvlText w:val=""/>
       <w:lvlJc w:val="left"/>
     </w:lvl>
-    <w:lvl w:ilvl="4" w:tplc="89AAC4AA">
+    <w:lvl w:ilvl="4" w:tplc="C1A0D1B0">
       <w:numFmt w:val="decimal"/>
       <w:lvlText w:val=""/>
       <w:lvlJc w:val="left"/>
     </w:lvl>
-    <w:lvl w:ilvl="5" w:tplc="5388194E">
+    <w:lvl w:ilvl="5" w:tplc="E70C55FC">
       <w:numFmt w:val="decimal"/>
       <w:lvlText w:val=""/>
       <w:lvlJc w:val="left"/>
     </w:lvl>
-    <w:lvl w:ilvl="6" w:tplc="1D72E442">
+    <w:lvl w:ilvl="6" w:tplc="0E16B410">
       <w:numFmt w:val="decimal"/>
       <w:lvlText w:val=""/>
       <w:lvlJc w:val="left"/>
     </w:lvl>
-    <w:lvl w:ilvl="7" w:tplc="3AE009C8">
+    <w:lvl w:ilvl="7" w:tplc="7552502C">
       <w:numFmt w:val="decimal"/>
       <w:lvlText w:val=""/>
       <w:lvlJc w:val="left"/>
     </w:lvl>
-    <w:lvl w:ilvl="8" w:tplc="ACB87EAA">
+    <w:lvl w:ilvl="8" w:tplc="1D20BE10">
       <w:numFmt w:val="decimal"/>
       <w:lvlText w:val=""/>
       <w:lvlJc w:val="left"/>
     </w:lvl>
   </w:abstractNum>
-  <w:abstractNum w:abstractNumId="2" w15:restartNumberingAfterBreak="0">
-    <w:nsid w:val="6F1369F3"/>
+  <w:abstractNum w:abstractNumId="1" w15:restartNumberingAfterBreak="0">
+    <w:nsid w:val="1D172EC8"/>
     <w:multiLevelType w:val="hybridMultilevel"/>
-    <w:tmpl w:val="9E6645FC"/>
-    <w:lvl w:ilvl="0" w:tplc="4552D862">
+    <w:tmpl w:val="D2743750"/>
+    <w:lvl w:ilvl="0" w:tplc="72AA46A6">
       <w:start w:val="1"/>
       <w:numFmt w:val="decimal"/>
       <w:lvlText w:val="%1."/>
@@ -31597,61 +31628,147 @@
         <w:ind w:left="540" w:hanging="360"/>
       </w:pPr>
     </w:lvl>
-    <w:lvl w:ilvl="1" w:tplc="D30C30DC">
+    <w:lvl w:ilvl="1" w:tplc="D7207C4C">
       <w:numFmt w:val="decimal"/>
       <w:lvlText w:val=""/>
       <w:lvlJc w:val="left"/>
     </w:lvl>
-    <w:lvl w:ilvl="2" w:tplc="CD665D98">
+    <w:lvl w:ilvl="2" w:tplc="0F28CF24">
       <w:numFmt w:val="decimal"/>
       <w:lvlText w:val=""/>
       <w:lvlJc w:val="left"/>
     </w:lvl>
-    <w:lvl w:ilvl="3" w:tplc="EE3C017C">
+    <w:lvl w:ilvl="3" w:tplc="3E9677DE">
       <w:numFmt w:val="decimal"/>
       <w:lvlText w:val=""/>
       <w:lvlJc w:val="left"/>
     </w:lvl>
-    <w:lvl w:ilvl="4" w:tplc="6DC24E08">
+    <w:lvl w:ilvl="4" w:tplc="F11C6566">
       <w:numFmt w:val="decimal"/>
       <w:lvlText w:val=""/>
       <w:lvlJc w:val="left"/>
     </w:lvl>
-    <w:lvl w:ilvl="5" w:tplc="E9920D52">
+    <w:lvl w:ilvl="5" w:tplc="7B30684C">
       <w:numFmt w:val="decimal"/>
       <w:lvlText w:val=""/>
       <w:lvlJc w:val="left"/>
     </w:lvl>
-    <w:lvl w:ilvl="6" w:tplc="4766A7B2">
+    <w:lvl w:ilvl="6" w:tplc="A0345DAC">
       <w:numFmt w:val="decimal"/>
       <w:lvlText w:val=""/>
       <w:lvlJc w:val="left"/>
     </w:lvl>
-    <w:lvl w:ilvl="7" w:tplc="07629028">
+    <w:lvl w:ilvl="7" w:tplc="26585ADA">
       <w:numFmt w:val="decimal"/>
       <w:lvlText w:val=""/>
       <w:lvlJc w:val="left"/>
     </w:lvl>
-    <w:lvl w:ilvl="8" w:tplc="EB22FFE8">
+    <w:lvl w:ilvl="8" w:tplc="F622067E">
       <w:numFmt w:val="decimal"/>
       <w:lvlText w:val=""/>
       <w:lvlJc w:val="left"/>
     </w:lvl>
   </w:abstractNum>
-  <w:num w:numId="1" w16cid:durableId="1644693345">
+  <w:abstractNum w:abstractNumId="2" w15:restartNumberingAfterBreak="0">
+    <w:nsid w:val="2FA508A3"/>
+    <w:multiLevelType w:val="hybridMultilevel"/>
+    <w:tmpl w:val="397E21BA"/>
+    <w:lvl w:ilvl="0" w:tplc="66A402EE" w:tentative="1">
+      <w:start w:val="1"/>
+      <w:numFmt w:val="bullet"/>
+      <w:lvlText w:val="●"/>
+      <w:lvlJc w:val="left"/>
+      <w:pPr>
+        <w:ind w:left="720" w:hanging="360"/>
+      </w:pPr>
+    </w:lvl>
+    <w:lvl w:ilvl="1" w:tplc="CBD40854" w:tentative="1">
+      <w:start w:val="1"/>
+      <w:numFmt w:val="bullet"/>
+      <w:lvlText w:val="○"/>
+      <w:lvlJc w:val="left"/>
+      <w:pPr>
+        <w:ind w:left="1440" w:hanging="360"/>
+      </w:pPr>
+    </w:lvl>
+    <w:lvl w:ilvl="2" w:tplc="D9343774" w:tentative="1">
+      <w:start w:val="1"/>
+      <w:numFmt w:val="bullet"/>
+      <w:lvlText w:val="■"/>
+      <w:lvlJc w:val="left"/>
+      <w:pPr>
+        <w:ind w:left="2160" w:hanging="360"/>
+      </w:pPr>
+    </w:lvl>
+    <w:lvl w:ilvl="3" w:tplc="DCD466F0" w:tentative="1">
+      <w:start w:val="1"/>
+      <w:numFmt w:val="bullet"/>
+      <w:lvlText w:val="●"/>
+      <w:lvlJc w:val="left"/>
+      <w:pPr>
+        <w:ind w:left="2880" w:hanging="360"/>
+      </w:pPr>
+    </w:lvl>
+    <w:lvl w:ilvl="4" w:tplc="685C24BE" w:tentative="1">
+      <w:start w:val="1"/>
+      <w:numFmt w:val="bullet"/>
+      <w:lvlText w:val="○"/>
+      <w:lvlJc w:val="left"/>
+      <w:pPr>
+        <w:ind w:left="3600" w:hanging="360"/>
+      </w:pPr>
+    </w:lvl>
+    <w:lvl w:ilvl="5" w:tplc="FC90E5D6" w:tentative="1">
+      <w:start w:val="1"/>
+      <w:numFmt w:val="bullet"/>
+      <w:lvlText w:val="■"/>
+      <w:lvlJc w:val="left"/>
+      <w:pPr>
+        <w:ind w:left="4320" w:hanging="360"/>
+      </w:pPr>
+    </w:lvl>
+    <w:lvl w:ilvl="6" w:tplc="CEAC57B0" w:tentative="1">
+      <w:start w:val="1"/>
+      <w:numFmt w:val="bullet"/>
+      <w:lvlText w:val="●"/>
+      <w:lvlJc w:val="left"/>
+      <w:pPr>
+        <w:ind w:left="5040" w:hanging="360"/>
+      </w:pPr>
+    </w:lvl>
+    <w:lvl w:ilvl="7" w:tplc="710C53CA" w:tentative="1">
+      <w:start w:val="1"/>
+      <w:numFmt w:val="bullet"/>
+      <w:lvlText w:val="●"/>
+      <w:lvlJc w:val="left"/>
+      <w:pPr>
+        <w:ind w:left="5760" w:hanging="360"/>
+      </w:pPr>
+    </w:lvl>
+    <w:lvl w:ilvl="8" w:tplc="F87C4C7E" w:tentative="1">
+      <w:start w:val="1"/>
+      <w:numFmt w:val="bullet"/>
+      <w:lvlText w:val="●"/>
+      <w:lvlJc w:val="left"/>
+      <w:pPr>
+        <w:ind w:left="6480" w:hanging="360"/>
+      </w:pPr>
+    </w:lvl>
+  </w:abstractNum>
+  <w:num w:numId="1" w16cid:durableId="1084687026">
+    <w:abstractNumId w:val="2"/>
+    <w:lvlOverride w:ilvl="0">
+      <w:startOverride w:val="1"/>
+    </w:lvlOverride>
+  </w:num>
+  <w:num w:numId="2" w16cid:durableId="740173422">
     <w:abstractNumId w:val="0"/>
     <w:lvlOverride w:ilvl="0">
       <w:startOverride w:val="1"/>
     </w:lvlOverride>
   </w:num>
-  <w:num w:numId="2" w16cid:durableId="490756262">
+  <w:num w:numId="3" w16cid:durableId="1881478552">
     <w:abstractNumId w:val="1"/>
-    <w:lvlOverride w:ilvl="0">
-      <w:startOverride w:val="1"/>
-    </w:lvlOverride>
-  </w:num>
-  <w:num w:numId="3" w16cid:durableId="1565797653">
-    <w:abstractNumId w:val="2"/>
     <w:lvlOverride w:ilvl="0">
       <w:startOverride w:val="1"/>
     </w:lvlOverride>
@@ -32292,7 +32409,7 @@
     <w:autoRedefine/>
     <w:uiPriority w:val="39"/>
     <w:unhideWhenUsed/>
-    <w:rsid w:val="00871E0A"/>
+    <w:rsid w:val="004C238B"/>
     <w:pPr>
       <w:spacing w:after="100"/>
     </w:pPr>
@@ -32304,7 +32421,7 @@
     <w:autoRedefine/>
     <w:uiPriority w:val="39"/>
     <w:unhideWhenUsed/>
-    <w:rsid w:val="00871E0A"/>
+    <w:rsid w:val="004C238B"/>
     <w:pPr>
       <w:spacing w:after="100"/>
       <w:ind w:left="240"/>

</xml_diff>